<commit_message>
cập nhật lại doc
</commit_message>
<xml_diff>
--- a/docs/Ke_hoach_Agile_quan_ca_phe.docx
+++ b/docs/Ke_hoach_Agile_quan_ca_phe.docx
@@ -11,7 +11,7 @@
           <w:rFonts w:ascii="Arial" w:cs="Arial" w:eastAsia="Arial" w:hAnsi="Arial"/>
           <w:b/>
           <w:bCs/>
-          <w:color w:val="1F3864"/>
+          <w:color w:val="000000"/>
           <w:sz w:val="44"/>
           <w:szCs w:val="44"/>
         </w:rPr>
@@ -35,7 +35,7 @@
     <w:p>
       <w:pPr>
         <w:pBdr>
-          <w:bottom w:val="single" w:color="1F3864" w:sz="8" w:space="4"/>
+          <w:bottom w:val="single" w:color="000000" w:sz="8" w:space="4"/>
         </w:pBdr>
         <w:spacing w:after="200"/>
       </w:pPr>
@@ -48,7 +48,7 @@
           <w:sz w:val="20"/>
           <w:szCs w:val="20"/>
         </w:rPr>
-        <w:t xml:space="preserve">Dựa trên Chương 3 – Agile Software Development; thời hạn nộp khoảng 07/11/2026; làm đủ toàn bộ chức năng trong đặc tả</w:t>
+        <w:t xml:space="preserve">Dựa trên Chương 3 (Agile Software Development); nộp khoảng 07/11/2026; làm đủ 11 chức năng chính của báo cáo</w:t>
       </w:r>
     </w:p>
     <w:p>
@@ -76,7 +76,7 @@
         <w:rPr>
           <w:rFonts w:ascii="Arial" w:cs="Arial" w:eastAsia="Arial" w:hAnsi="Arial"/>
         </w:rPr>
-        <w:t xml:space="preserve">Phạm vi: toàn bộ chức năng trong file đặc tả (134 điểm), không hoãn module nào.</w:t>
+        <w:t xml:space="preserve">Phạm vi: 11 chức năng chính, gồm 49 tính năng trong file đặc tả (134 điểm), không hoãn module nào. Cách chia 11 chức năng giống Chương 2 của báo cáo.</w:t>
       </w:r>
     </w:p>
     <w:p>
@@ -108,7 +108,7 @@
         <w:rPr>
           <w:rFonts w:ascii="Arial" w:cs="Arial" w:eastAsia="Arial" w:hAnsi="Arial"/>
         </w:rPr>
-        <w:t xml:space="preserve">Sprint dài 1 tuần (lệch khỏi slide: 2–4 tuần) để đo velocity sớm và điều chỉnh kịp.</w:t>
+        <w:t xml:space="preserve">Sprint dài 1 tuần (slide nói 2 đến 4 tuần) để đo velocity sớm và điều chỉnh kịp.</w:t>
       </w:r>
     </w:p>
     <w:p>
@@ -522,7 +522,7 @@
                 <w:sz w:val="18"/>
                 <w:szCs w:val="18"/>
               </w:rPr>
-              <w:t xml:space="preserve">Bảng ở mục 4, lấy ID từ file đặc tả </w:t>
+              <w:t xml:space="preserve">Bảng ở mục 4, gom theo 11 chức năng chính của báo cáo; ID tính năng lấy từ file đặc tả </w:t>
             </w:r>
             <w:r>
               <w:rPr>
@@ -533,6 +533,16 @@
                 <w:szCs w:val="18"/>
               </w:rPr>
               <w:t xml:space="preserve">Dac_ta_tinh_nang_quan_ly_quan_ca_phe.docx</w:t>
+            </w:r>
+            <w:r>
+              <w:rPr>
+                <w:rFonts w:ascii="Arial" w:cs="Arial" w:eastAsia="Arial" w:hAnsi="Arial"/>
+                <w:b w:val="false"/>
+                <w:bCs w:val="false"/>
+                <w:sz w:val="18"/>
+                <w:szCs w:val="18"/>
+              </w:rPr>
+              <w:t xml:space="preserve"> và được đặc tả chi tiết ở Chương 4 của báo cáo</w:t>
             </w:r>
           </w:p>
         </w:tc>
@@ -808,7 +818,7 @@
                 <w:sz w:val="18"/>
                 <w:szCs w:val="18"/>
               </w:rPr>
-              <w:t xml:space="preserve">Khoảng 20 phút cuối sprint (slide không có, nhưng thường đi kèm Scrum)</w:t>
+              <w:t xml:space="preserve">Khoảng 20 phút cuối sprint (slide không nhắc, nhưng thường đi kèm Scrum)</w:t>
             </w:r>
           </w:p>
         </w:tc>
@@ -944,7 +954,19 @@
         <w:rPr>
           <w:rFonts w:ascii="Arial" w:cs="Arial" w:eastAsia="Arial" w:hAnsi="Arial"/>
         </w:rPr>
-        <w:t xml:space="preserve">), thêm index và UNIQUE; dữ liệu mẫu; khung API và khung test; CI chạy toàn bộ test mỗi lần push.</w:t>
+        <w:t xml:space="preserve">), thêm index và UNIQUE; dữ liệu mẫu; khung API và khung test; quy ước chạy toàn bộ test (</w:t>
+      </w:r>
+      <w:r>
+        <w:rPr>
+          <w:rFonts w:ascii="Consolas" w:cs="Consolas" w:eastAsia="Consolas" w:hAnsi="Consolas"/>
+        </w:rPr>
+        <w:t xml:space="preserve">npm test</w:t>
+      </w:r>
+      <w:r>
+        <w:rPr>
+          <w:rFonts w:ascii="Arial" w:cs="Arial" w:eastAsia="Arial" w:hAnsi="Arial"/>
+        </w:rPr>
+        <w:t xml:space="preserve">) trước mỗi lần merge.</w:t>
       </w:r>
     </w:p>
     <w:p>
@@ -988,7 +1010,7 @@
         <w:rPr>
           <w:rFonts w:ascii="Arial" w:cs="Arial" w:eastAsia="Arial" w:hAnsi="Arial"/>
         </w:rPr>
-        <w:t xml:space="preserve">4. Product backlog (tổng 134 điểm, ước lượng ban đầu)</w:t>
+        <w:t xml:space="preserve">4. Product backlog (134 điểm, ước lượng ban đầu)</w:t>
       </w:r>
     </w:p>
     <w:tbl>
@@ -1004,9 +1026,10 @@
         </w:tblBorders>
       </w:tblPr>
       <w:tblGrid>
-        <w:gridCol w:w="2400"/>
-        <w:gridCol w:w="10878"/>
-        <w:gridCol w:w="1400"/>
+        <w:gridCol w:w="1900"/>
+        <w:gridCol w:w="2100"/>
+        <w:gridCol w:w="8678"/>
+        <w:gridCol w:w="2000"/>
       </w:tblGrid>
       <w:tr>
         <w:trPr>
@@ -1015,7 +1038,7 @@
         </w:trPr>
         <w:tc>
           <w:tcPr>
-            <w:tcW w:type="dxa" w:w="2400"/>
+            <w:tcW w:type="dxa" w:w="1900"/>
             <w:tcBorders>
               <w:top w:val="single" w:color="BFBFBF" w:sz="4"/>
               <w:left w:val="single" w:color="BFBFBF" w:sz="4"/>
@@ -1048,7 +1071,7 @@
         </w:tc>
         <w:tc>
           <w:tcPr>
-            <w:tcW w:type="dxa" w:w="10878"/>
+            <w:tcW w:type="dxa" w:w="2100"/>
             <w:tcBorders>
               <w:top w:val="single" w:color="BFBFBF" w:sz="4"/>
               <w:left w:val="single" w:color="BFBFBF" w:sz="4"/>
@@ -1075,13 +1098,46 @@
                 <w:sz w:val="18"/>
                 <w:szCs w:val="18"/>
               </w:rPr>
+              <w:t xml:space="preserve">Chức năng chính</w:t>
+            </w:r>
+          </w:p>
+        </w:tc>
+        <w:tc>
+          <w:tcPr>
+            <w:tcW w:type="dxa" w:w="8678"/>
+            <w:tcBorders>
+              <w:top w:val="single" w:color="BFBFBF" w:sz="4"/>
+              <w:left w:val="single" w:color="BFBFBF" w:sz="4"/>
+              <w:bottom w:val="single" w:color="BFBFBF" w:sz="4"/>
+              <w:right w:val="single" w:color="BFBFBF" w:sz="4"/>
+            </w:tcBorders>
+            <w:shd w:fill="D9E2F3" w:color="auto" w:val="clear"/>
+            <w:tcMar>
+              <w:top w:type="dxa" w:w="60"/>
+              <w:left w:type="dxa" w:w="90"/>
+              <w:bottom w:type="dxa" w:w="60"/>
+              <w:right w:type="dxa" w:w="90"/>
+            </w:tcMar>
+          </w:tcPr>
+          <w:p>
+            <w:pPr>
+              <w:spacing w:after="20"/>
+            </w:pPr>
+            <w:r>
+              <w:rPr>
+                <w:rFonts w:ascii="Arial" w:cs="Arial" w:eastAsia="Arial" w:hAnsi="Arial"/>
+                <w:b/>
+                <w:bCs/>
+                <w:sz w:val="18"/>
+                <w:szCs w:val="18"/>
+              </w:rPr>
               <w:t xml:space="preserve">Story (ID đặc tả)</w:t>
             </w:r>
           </w:p>
         </w:tc>
         <w:tc>
           <w:tcPr>
-            <w:tcW w:type="dxa" w:w="1400"/>
+            <w:tcW w:type="dxa" w:w="2000"/>
             <w:tcBorders>
               <w:top w:val="single" w:color="BFBFBF" w:sz="4"/>
               <w:left w:val="single" w:color="BFBFBF" w:sz="4"/>
@@ -1119,7 +1175,7 @@
         </w:trPr>
         <w:tc>
           <w:tcPr>
-            <w:tcW w:type="dxa" w:w="2400"/>
+            <w:tcW w:type="dxa" w:w="1900"/>
             <w:tcBorders>
               <w:top w:val="single" w:color="BFBFBF" w:sz="4"/>
               <w:left w:val="single" w:color="BFBFBF" w:sz="4"/>
@@ -1151,65 +1207,97 @@
         </w:tc>
         <w:tc>
           <w:tcPr>
-            <w:tcW w:type="dxa" w:w="10878"/>
-            <w:tcBorders>
-              <w:top w:val="single" w:color="BFBFBF" w:sz="4"/>
-              <w:left w:val="single" w:color="BFBFBF" w:sz="4"/>
-              <w:bottom w:val="single" w:color="BFBFBF" w:sz="4"/>
-              <w:right w:val="single" w:color="BFBFBF" w:sz="4"/>
-            </w:tcBorders>
-            <w:tcMar>
-              <w:top w:type="dxa" w:w="60"/>
-              <w:left w:type="dxa" w:w="90"/>
-              <w:bottom w:type="dxa" w:w="60"/>
-              <w:right w:type="dxa" w:w="90"/>
-            </w:tcMar>
-          </w:tcPr>
-          <w:p>
-            <w:pPr>
-              <w:spacing w:after="20"/>
-            </w:pPr>
-            <w:r>
-              <w:rPr>
-                <w:rFonts w:ascii="Arial" w:cs="Arial" w:eastAsia="Arial" w:hAnsi="Arial"/>
-                <w:b w:val="false"/>
-                <w:bCs w:val="false"/>
-                <w:sz w:val="18"/>
-                <w:szCs w:val="18"/>
-              </w:rPr>
-              <w:t xml:space="preserve">AUTH-01 đăng nhập; middleware phân quyền A/Q/N</w:t>
-            </w:r>
-          </w:p>
-        </w:tc>
-        <w:tc>
-          <w:tcPr>
-            <w:tcW w:type="dxa" w:w="1400"/>
-            <w:tcBorders>
-              <w:top w:val="single" w:color="BFBFBF" w:sz="4"/>
-              <w:left w:val="single" w:color="BFBFBF" w:sz="4"/>
-              <w:bottom w:val="single" w:color="BFBFBF" w:sz="4"/>
-              <w:right w:val="single" w:color="BFBFBF" w:sz="4"/>
-            </w:tcBorders>
-            <w:tcMar>
-              <w:top w:type="dxa" w:w="60"/>
-              <w:left w:type="dxa" w:w="90"/>
-              <w:bottom w:type="dxa" w:w="60"/>
-              <w:right w:type="dxa" w:w="90"/>
-            </w:tcMar>
-          </w:tcPr>
-          <w:p>
-            <w:pPr>
-              <w:spacing w:after="20"/>
-            </w:pPr>
-            <w:r>
-              <w:rPr>
-                <w:rFonts w:ascii="Arial" w:cs="Arial" w:eastAsia="Arial" w:hAnsi="Arial"/>
-                <w:b w:val="false"/>
-                <w:bCs w:val="false"/>
-                <w:sz w:val="18"/>
-                <w:szCs w:val="18"/>
-              </w:rPr>
-              <w:t xml:space="preserve">3 + 3</w:t>
+            <w:tcW w:type="dxa" w:w="2100"/>
+            <w:tcBorders>
+              <w:top w:val="single" w:color="BFBFBF" w:sz="4"/>
+              <w:left w:val="single" w:color="BFBFBF" w:sz="4"/>
+              <w:bottom w:val="single" w:color="BFBFBF" w:sz="4"/>
+              <w:right w:val="single" w:color="BFBFBF" w:sz="4"/>
+            </w:tcBorders>
+            <w:tcMar>
+              <w:top w:type="dxa" w:w="60"/>
+              <w:left w:type="dxa" w:w="90"/>
+              <w:bottom w:type="dxa" w:w="60"/>
+              <w:right w:type="dxa" w:w="90"/>
+            </w:tcMar>
+          </w:tcPr>
+          <w:p>
+            <w:pPr>
+              <w:spacing w:after="20"/>
+            </w:pPr>
+            <w:r>
+              <w:rPr>
+                <w:rFonts w:ascii="Arial" w:cs="Arial" w:eastAsia="Arial" w:hAnsi="Arial"/>
+                <w:b w:val="false"/>
+                <w:bCs w:val="false"/>
+                <w:sz w:val="18"/>
+                <w:szCs w:val="18"/>
+              </w:rPr>
+              <w:t xml:space="preserve">Dùng chung</w:t>
+            </w:r>
+          </w:p>
+        </w:tc>
+        <w:tc>
+          <w:tcPr>
+            <w:tcW w:type="dxa" w:w="8678"/>
+            <w:tcBorders>
+              <w:top w:val="single" w:color="BFBFBF" w:sz="4"/>
+              <w:left w:val="single" w:color="BFBFBF" w:sz="4"/>
+              <w:bottom w:val="single" w:color="BFBFBF" w:sz="4"/>
+              <w:right w:val="single" w:color="BFBFBF" w:sz="4"/>
+            </w:tcBorders>
+            <w:tcMar>
+              <w:top w:type="dxa" w:w="60"/>
+              <w:left w:type="dxa" w:w="90"/>
+              <w:bottom w:type="dxa" w:w="60"/>
+              <w:right w:type="dxa" w:w="90"/>
+            </w:tcMar>
+          </w:tcPr>
+          <w:p>
+            <w:pPr>
+              <w:spacing w:after="20"/>
+            </w:pPr>
+            <w:r>
+              <w:rPr>
+                <w:rFonts w:ascii="Arial" w:cs="Arial" w:eastAsia="Arial" w:hAnsi="Arial"/>
+                <w:b w:val="false"/>
+                <w:bCs w:val="false"/>
+                <w:sz w:val="18"/>
+                <w:szCs w:val="18"/>
+              </w:rPr>
+              <w:t xml:space="preserve">Middleware phân quyền A/Q/N</w:t>
+            </w:r>
+          </w:p>
+        </w:tc>
+        <w:tc>
+          <w:tcPr>
+            <w:tcW w:type="dxa" w:w="2000"/>
+            <w:tcBorders>
+              <w:top w:val="single" w:color="BFBFBF" w:sz="4"/>
+              <w:left w:val="single" w:color="BFBFBF" w:sz="4"/>
+              <w:bottom w:val="single" w:color="BFBFBF" w:sz="4"/>
+              <w:right w:val="single" w:color="BFBFBF" w:sz="4"/>
+            </w:tcBorders>
+            <w:tcMar>
+              <w:top w:type="dxa" w:w="60"/>
+              <w:left w:type="dxa" w:w="90"/>
+              <w:bottom w:type="dxa" w:w="60"/>
+              <w:right w:type="dxa" w:w="90"/>
+            </w:tcMar>
+          </w:tcPr>
+          <w:p>
+            <w:pPr>
+              <w:spacing w:after="20"/>
+            </w:pPr>
+            <w:r>
+              <w:rPr>
+                <w:rFonts w:ascii="Arial" w:cs="Arial" w:eastAsia="Arial" w:hAnsi="Arial"/>
+                <w:b w:val="false"/>
+                <w:bCs w:val="false"/>
+                <w:sz w:val="18"/>
+                <w:szCs w:val="18"/>
+              </w:rPr>
+              <w:t xml:space="preserve">3</w:t>
             </w:r>
           </w:p>
         </w:tc>
@@ -1220,97 +1308,129 @@
         </w:trPr>
         <w:tc>
           <w:tcPr>
-            <w:tcW w:type="dxa" w:w="2400"/>
-            <w:tcBorders>
-              <w:top w:val="single" w:color="BFBFBF" w:sz="4"/>
-              <w:left w:val="single" w:color="BFBFBF" w:sz="4"/>
-              <w:bottom w:val="single" w:color="BFBFBF" w:sz="4"/>
-              <w:right w:val="single" w:color="BFBFBF" w:sz="4"/>
-            </w:tcBorders>
-            <w:tcMar>
-              <w:top w:type="dxa" w:w="60"/>
-              <w:left w:type="dxa" w:w="90"/>
-              <w:bottom w:type="dxa" w:w="60"/>
-              <w:right w:type="dxa" w:w="90"/>
-            </w:tcMar>
-          </w:tcPr>
-          <w:p>
-            <w:pPr>
-              <w:spacing w:after="20"/>
-            </w:pPr>
-            <w:r>
-              <w:rPr>
-                <w:rFonts w:ascii="Arial" w:cs="Arial" w:eastAsia="Arial" w:hAnsi="Arial"/>
-                <w:b w:val="false"/>
-                <w:bCs w:val="false"/>
-                <w:sz w:val="18"/>
-                <w:szCs w:val="18"/>
-              </w:rPr>
-              <w:t xml:space="preserve">Sản phẩm</w:t>
-            </w:r>
-          </w:p>
-        </w:tc>
-        <w:tc>
-          <w:tcPr>
-            <w:tcW w:type="dxa" w:w="10878"/>
-            <w:tcBorders>
-              <w:top w:val="single" w:color="BFBFBF" w:sz="4"/>
-              <w:left w:val="single" w:color="BFBFBF" w:sz="4"/>
-              <w:bottom w:val="single" w:color="BFBFBF" w:sz="4"/>
-              <w:right w:val="single" w:color="BFBFBF" w:sz="4"/>
-            </w:tcBorders>
-            <w:tcMar>
-              <w:top w:type="dxa" w:w="60"/>
-              <w:left w:type="dxa" w:w="90"/>
-              <w:bottom w:type="dxa" w:w="60"/>
-              <w:right w:type="dxa" w:w="90"/>
-            </w:tcMar>
-          </w:tcPr>
-          <w:p>
-            <w:pPr>
-              <w:spacing w:after="20"/>
-            </w:pPr>
-            <w:r>
-              <w:rPr>
-                <w:rFonts w:ascii="Arial" w:cs="Arial" w:eastAsia="Arial" w:hAnsi="Arial"/>
-                <w:b w:val="false"/>
-                <w:bCs w:val="false"/>
-                <w:sz w:val="18"/>
-                <w:szCs w:val="18"/>
-              </w:rPr>
-              <w:t xml:space="preserve">SP-01 CRUD sản phẩm và danh mục (đặc tả chưa có, thêm mới)</w:t>
-            </w:r>
-          </w:p>
-        </w:tc>
-        <w:tc>
-          <w:tcPr>
-            <w:tcW w:type="dxa" w:w="1400"/>
-            <w:tcBorders>
-              <w:top w:val="single" w:color="BFBFBF" w:sz="4"/>
-              <w:left w:val="single" w:color="BFBFBF" w:sz="4"/>
-              <w:bottom w:val="single" w:color="BFBFBF" w:sz="4"/>
-              <w:right w:val="single" w:color="BFBFBF" w:sz="4"/>
-            </w:tcBorders>
-            <w:tcMar>
-              <w:top w:type="dxa" w:w="60"/>
-              <w:left w:type="dxa" w:w="90"/>
-              <w:bottom w:type="dxa" w:w="60"/>
-              <w:right w:type="dxa" w:w="90"/>
-            </w:tcMar>
-          </w:tcPr>
-          <w:p>
-            <w:pPr>
-              <w:spacing w:after="20"/>
-            </w:pPr>
-            <w:r>
-              <w:rPr>
-                <w:rFonts w:ascii="Arial" w:cs="Arial" w:eastAsia="Arial" w:hAnsi="Arial"/>
-                <w:b w:val="false"/>
-                <w:bCs w:val="false"/>
-                <w:sz w:val="18"/>
-                <w:szCs w:val="18"/>
-              </w:rPr>
-              <w:t xml:space="preserve">5</w:t>
+            <w:tcW w:type="dxa" w:w="1900"/>
+            <w:tcBorders>
+              <w:top w:val="single" w:color="BFBFBF" w:sz="4"/>
+              <w:left w:val="single" w:color="BFBFBF" w:sz="4"/>
+              <w:bottom w:val="single" w:color="BFBFBF" w:sz="4"/>
+              <w:right w:val="single" w:color="BFBFBF" w:sz="4"/>
+            </w:tcBorders>
+            <w:tcMar>
+              <w:top w:type="dxa" w:w="60"/>
+              <w:left w:type="dxa" w:w="90"/>
+              <w:bottom w:type="dxa" w:w="60"/>
+              <w:right w:type="dxa" w:w="90"/>
+            </w:tcMar>
+          </w:tcPr>
+          <w:p>
+            <w:pPr>
+              <w:spacing w:after="20"/>
+            </w:pPr>
+            <w:r>
+              <w:rPr>
+                <w:rFonts w:ascii="Arial" w:cs="Arial" w:eastAsia="Arial" w:hAnsi="Arial"/>
+                <w:b w:val="false"/>
+                <w:bCs w:val="false"/>
+                <w:sz w:val="18"/>
+                <w:szCs w:val="18"/>
+              </w:rPr>
+              <w:t xml:space="preserve">Tài khoản</w:t>
+            </w:r>
+          </w:p>
+        </w:tc>
+        <w:tc>
+          <w:tcPr>
+            <w:tcW w:type="dxa" w:w="2100"/>
+            <w:tcBorders>
+              <w:top w:val="single" w:color="BFBFBF" w:sz="4"/>
+              <w:left w:val="single" w:color="BFBFBF" w:sz="4"/>
+              <w:bottom w:val="single" w:color="BFBFBF" w:sz="4"/>
+              <w:right w:val="single" w:color="BFBFBF" w:sz="4"/>
+            </w:tcBorders>
+            <w:tcMar>
+              <w:top w:type="dxa" w:w="60"/>
+              <w:left w:type="dxa" w:w="90"/>
+              <w:bottom w:type="dxa" w:w="60"/>
+              <w:right w:type="dxa" w:w="90"/>
+            </w:tcMar>
+          </w:tcPr>
+          <w:p>
+            <w:pPr>
+              <w:spacing w:after="20"/>
+            </w:pPr>
+            <w:r>
+              <w:rPr>
+                <w:rFonts w:ascii="Arial" w:cs="Arial" w:eastAsia="Arial" w:hAnsi="Arial"/>
+                <w:b w:val="false"/>
+                <w:bCs w:val="false"/>
+                <w:sz w:val="18"/>
+                <w:szCs w:val="18"/>
+              </w:rPr>
+              <w:t xml:space="preserve">CN-01</w:t>
+            </w:r>
+          </w:p>
+        </w:tc>
+        <w:tc>
+          <w:tcPr>
+            <w:tcW w:type="dxa" w:w="8678"/>
+            <w:tcBorders>
+              <w:top w:val="single" w:color="BFBFBF" w:sz="4"/>
+              <w:left w:val="single" w:color="BFBFBF" w:sz="4"/>
+              <w:bottom w:val="single" w:color="BFBFBF" w:sz="4"/>
+              <w:right w:val="single" w:color="BFBFBF" w:sz="4"/>
+            </w:tcBorders>
+            <w:tcMar>
+              <w:top w:type="dxa" w:w="60"/>
+              <w:left w:type="dxa" w:w="90"/>
+              <w:bottom w:type="dxa" w:w="60"/>
+              <w:right w:type="dxa" w:w="90"/>
+            </w:tcMar>
+          </w:tcPr>
+          <w:p>
+            <w:pPr>
+              <w:spacing w:after="20"/>
+            </w:pPr>
+            <w:r>
+              <w:rPr>
+                <w:rFonts w:ascii="Arial" w:cs="Arial" w:eastAsia="Arial" w:hAnsi="Arial"/>
+                <w:b w:val="false"/>
+                <w:bCs w:val="false"/>
+                <w:sz w:val="18"/>
+                <w:szCs w:val="18"/>
+              </w:rPr>
+              <w:t xml:space="preserve">AUTH-01 đăng nhập (S1); AUTH-02 đổi mật khẩu (S4)</w:t>
+            </w:r>
+          </w:p>
+        </w:tc>
+        <w:tc>
+          <w:tcPr>
+            <w:tcW w:type="dxa" w:w="2000"/>
+            <w:tcBorders>
+              <w:top w:val="single" w:color="BFBFBF" w:sz="4"/>
+              <w:left w:val="single" w:color="BFBFBF" w:sz="4"/>
+              <w:bottom w:val="single" w:color="BFBFBF" w:sz="4"/>
+              <w:right w:val="single" w:color="BFBFBF" w:sz="4"/>
+            </w:tcBorders>
+            <w:tcMar>
+              <w:top w:type="dxa" w:w="60"/>
+              <w:left w:type="dxa" w:w="90"/>
+              <w:bottom w:type="dxa" w:w="60"/>
+              <w:right w:type="dxa" w:w="90"/>
+            </w:tcMar>
+          </w:tcPr>
+          <w:p>
+            <w:pPr>
+              <w:spacing w:after="20"/>
+            </w:pPr>
+            <w:r>
+              <w:rPr>
+                <w:rFonts w:ascii="Arial" w:cs="Arial" w:eastAsia="Arial" w:hAnsi="Arial"/>
+                <w:b w:val="false"/>
+                <w:bCs w:val="false"/>
+                <w:sz w:val="18"/>
+                <w:szCs w:val="18"/>
+              </w:rPr>
+              <w:t xml:space="preserve">3 + 2</w:t>
             </w:r>
           </w:p>
         </w:tc>
@@ -1321,97 +1441,129 @@
         </w:trPr>
         <w:tc>
           <w:tcPr>
-            <w:tcW w:type="dxa" w:w="2400"/>
-            <w:tcBorders>
-              <w:top w:val="single" w:color="BFBFBF" w:sz="4"/>
-              <w:left w:val="single" w:color="BFBFBF" w:sz="4"/>
-              <w:bottom w:val="single" w:color="BFBFBF" w:sz="4"/>
-              <w:right w:val="single" w:color="BFBFBF" w:sz="4"/>
-            </w:tcBorders>
-            <w:tcMar>
-              <w:top w:type="dxa" w:w="60"/>
-              <w:left w:type="dxa" w:w="90"/>
-              <w:bottom w:type="dxa" w:w="60"/>
-              <w:right w:type="dxa" w:w="90"/>
-            </w:tcMar>
-          </w:tcPr>
-          <w:p>
-            <w:pPr>
-              <w:spacing w:after="20"/>
-            </w:pPr>
-            <w:r>
-              <w:rPr>
-                <w:rFonts w:ascii="Arial" w:cs="Arial" w:eastAsia="Arial" w:hAnsi="Arial"/>
-                <w:b w:val="false"/>
-                <w:bCs w:val="false"/>
-                <w:sz w:val="18"/>
-                <w:szCs w:val="18"/>
-              </w:rPr>
-              <w:t xml:space="preserve">POS</w:t>
-            </w:r>
-          </w:p>
-        </w:tc>
-        <w:tc>
-          <w:tcPr>
-            <w:tcW w:type="dxa" w:w="10878"/>
-            <w:tcBorders>
-              <w:top w:val="single" w:color="BFBFBF" w:sz="4"/>
-              <w:left w:val="single" w:color="BFBFBF" w:sz="4"/>
-              <w:bottom w:val="single" w:color="BFBFBF" w:sz="4"/>
-              <w:right w:val="single" w:color="BFBFBF" w:sz="4"/>
-            </w:tcBorders>
-            <w:tcMar>
-              <w:top w:type="dxa" w:w="60"/>
-              <w:left w:type="dxa" w:w="90"/>
-              <w:bottom w:type="dxa" w:w="60"/>
-              <w:right w:type="dxa" w:w="90"/>
-            </w:tcMar>
-          </w:tcPr>
-          <w:p>
-            <w:pPr>
-              <w:spacing w:after="20"/>
-            </w:pPr>
-            <w:r>
-              <w:rPr>
-                <w:rFonts w:ascii="Arial" w:cs="Arial" w:eastAsia="Arial" w:hAnsi="Arial"/>
-                <w:b w:val="false"/>
-                <w:bCs w:val="false"/>
-                <w:sz w:val="18"/>
-                <w:szCs w:val="18"/>
-              </w:rPr>
-              <w:t xml:space="preserve">POS-01 xem menu; POS-02 tạo order; POS-10 danh sách order</w:t>
-            </w:r>
-          </w:p>
-        </w:tc>
-        <w:tc>
-          <w:tcPr>
-            <w:tcW w:type="dxa" w:w="1400"/>
-            <w:tcBorders>
-              <w:top w:val="single" w:color="BFBFBF" w:sz="4"/>
-              <w:left w:val="single" w:color="BFBFBF" w:sz="4"/>
-              <w:bottom w:val="single" w:color="BFBFBF" w:sz="4"/>
-              <w:right w:val="single" w:color="BFBFBF" w:sz="4"/>
-            </w:tcBorders>
-            <w:tcMar>
-              <w:top w:type="dxa" w:w="60"/>
-              <w:left w:type="dxa" w:w="90"/>
-              <w:bottom w:type="dxa" w:w="60"/>
-              <w:right w:type="dxa" w:w="90"/>
-            </w:tcMar>
-          </w:tcPr>
-          <w:p>
-            <w:pPr>
-              <w:spacing w:after="20"/>
-            </w:pPr>
-            <w:r>
-              <w:rPr>
-                <w:rFonts w:ascii="Arial" w:cs="Arial" w:eastAsia="Arial" w:hAnsi="Arial"/>
-                <w:b w:val="false"/>
-                <w:bCs w:val="false"/>
-                <w:sz w:val="18"/>
-                <w:szCs w:val="18"/>
-              </w:rPr>
-              <w:t xml:space="preserve">2 + 8 + 3</w:t>
+            <w:tcW w:type="dxa" w:w="1900"/>
+            <w:tcBorders>
+              <w:top w:val="single" w:color="BFBFBF" w:sz="4"/>
+              <w:left w:val="single" w:color="BFBFBF" w:sz="4"/>
+              <w:bottom w:val="single" w:color="BFBFBF" w:sz="4"/>
+              <w:right w:val="single" w:color="BFBFBF" w:sz="4"/>
+            </w:tcBorders>
+            <w:tcMar>
+              <w:top w:type="dxa" w:w="60"/>
+              <w:left w:type="dxa" w:w="90"/>
+              <w:bottom w:type="dxa" w:w="60"/>
+              <w:right w:type="dxa" w:w="90"/>
+            </w:tcMar>
+          </w:tcPr>
+          <w:p>
+            <w:pPr>
+              <w:spacing w:after="20"/>
+            </w:pPr>
+            <w:r>
+              <w:rPr>
+                <w:rFonts w:ascii="Arial" w:cs="Arial" w:eastAsia="Arial" w:hAnsi="Arial"/>
+                <w:b w:val="false"/>
+                <w:bCs w:val="false"/>
+                <w:sz w:val="18"/>
+                <w:szCs w:val="18"/>
+              </w:rPr>
+              <w:t xml:space="preserve">Sản phẩm</w:t>
+            </w:r>
+          </w:p>
+        </w:tc>
+        <w:tc>
+          <w:tcPr>
+            <w:tcW w:type="dxa" w:w="2100"/>
+            <w:tcBorders>
+              <w:top w:val="single" w:color="BFBFBF" w:sz="4"/>
+              <w:left w:val="single" w:color="BFBFBF" w:sz="4"/>
+              <w:bottom w:val="single" w:color="BFBFBF" w:sz="4"/>
+              <w:right w:val="single" w:color="BFBFBF" w:sz="4"/>
+            </w:tcBorders>
+            <w:tcMar>
+              <w:top w:type="dxa" w:w="60"/>
+              <w:left w:type="dxa" w:w="90"/>
+              <w:bottom w:type="dxa" w:w="60"/>
+              <w:right w:type="dxa" w:w="90"/>
+            </w:tcMar>
+          </w:tcPr>
+          <w:p>
+            <w:pPr>
+              <w:spacing w:after="20"/>
+            </w:pPr>
+            <w:r>
+              <w:rPr>
+                <w:rFonts w:ascii="Arial" w:cs="Arial" w:eastAsia="Arial" w:hAnsi="Arial"/>
+                <w:b w:val="false"/>
+                <w:bCs w:val="false"/>
+                <w:sz w:val="18"/>
+                <w:szCs w:val="18"/>
+              </w:rPr>
+              <w:t xml:space="preserve">CN-02</w:t>
+            </w:r>
+          </w:p>
+        </w:tc>
+        <w:tc>
+          <w:tcPr>
+            <w:tcW w:type="dxa" w:w="8678"/>
+            <w:tcBorders>
+              <w:top w:val="single" w:color="BFBFBF" w:sz="4"/>
+              <w:left w:val="single" w:color="BFBFBF" w:sz="4"/>
+              <w:bottom w:val="single" w:color="BFBFBF" w:sz="4"/>
+              <w:right w:val="single" w:color="BFBFBF" w:sz="4"/>
+            </w:tcBorders>
+            <w:tcMar>
+              <w:top w:type="dxa" w:w="60"/>
+              <w:left w:type="dxa" w:w="90"/>
+              <w:bottom w:type="dxa" w:w="60"/>
+              <w:right w:type="dxa" w:w="90"/>
+            </w:tcMar>
+          </w:tcPr>
+          <w:p>
+            <w:pPr>
+              <w:spacing w:after="20"/>
+            </w:pPr>
+            <w:r>
+              <w:rPr>
+                <w:rFonts w:ascii="Arial" w:cs="Arial" w:eastAsia="Arial" w:hAnsi="Arial"/>
+                <w:b w:val="false"/>
+                <w:bCs w:val="false"/>
+                <w:sz w:val="18"/>
+                <w:szCs w:val="18"/>
+              </w:rPr>
+              <w:t xml:space="preserve">SP-01…SP-05 danh mục, sản phẩm (đặc tả chi tiết ở Chương 4)</w:t>
+            </w:r>
+          </w:p>
+        </w:tc>
+        <w:tc>
+          <w:tcPr>
+            <w:tcW w:type="dxa" w:w="2000"/>
+            <w:tcBorders>
+              <w:top w:val="single" w:color="BFBFBF" w:sz="4"/>
+              <w:left w:val="single" w:color="BFBFBF" w:sz="4"/>
+              <w:bottom w:val="single" w:color="BFBFBF" w:sz="4"/>
+              <w:right w:val="single" w:color="BFBFBF" w:sz="4"/>
+            </w:tcBorders>
+            <w:tcMar>
+              <w:top w:type="dxa" w:w="60"/>
+              <w:left w:type="dxa" w:w="90"/>
+              <w:bottom w:type="dxa" w:w="60"/>
+              <w:right w:type="dxa" w:w="90"/>
+            </w:tcMar>
+          </w:tcPr>
+          <w:p>
+            <w:pPr>
+              <w:spacing w:after="20"/>
+            </w:pPr>
+            <w:r>
+              <w:rPr>
+                <w:rFonts w:ascii="Arial" w:cs="Arial" w:eastAsia="Arial" w:hAnsi="Arial"/>
+                <w:b w:val="false"/>
+                <w:bCs w:val="false"/>
+                <w:sz w:val="18"/>
+                <w:szCs w:val="18"/>
+              </w:rPr>
+              <w:t xml:space="preserve">5</w:t>
             </w:r>
           </w:p>
         </w:tc>
@@ -1422,97 +1574,129 @@
         </w:trPr>
         <w:tc>
           <w:tcPr>
-            <w:tcW w:type="dxa" w:w="2400"/>
-            <w:tcBorders>
-              <w:top w:val="single" w:color="BFBFBF" w:sz="4"/>
-              <w:left w:val="single" w:color="BFBFBF" w:sz="4"/>
-              <w:bottom w:val="single" w:color="BFBFBF" w:sz="4"/>
-              <w:right w:val="single" w:color="BFBFBF" w:sz="4"/>
-            </w:tcBorders>
-            <w:tcMar>
-              <w:top w:type="dxa" w:w="60"/>
-              <w:left w:type="dxa" w:w="90"/>
-              <w:bottom w:type="dxa" w:w="60"/>
-              <w:right w:type="dxa" w:w="90"/>
-            </w:tcMar>
-          </w:tcPr>
-          <w:p>
-            <w:pPr>
-              <w:spacing w:after="20"/>
-            </w:pPr>
-            <w:r>
-              <w:rPr>
-                <w:rFonts w:ascii="Arial" w:cs="Arial" w:eastAsia="Arial" w:hAnsi="Arial"/>
-                <w:b w:val="false"/>
-                <w:bCs w:val="false"/>
-                <w:sz w:val="18"/>
-                <w:szCs w:val="18"/>
-              </w:rPr>
-              <w:t xml:space="preserve">POS</w:t>
-            </w:r>
-          </w:p>
-        </w:tc>
-        <w:tc>
-          <w:tcPr>
-            <w:tcW w:type="dxa" w:w="10878"/>
-            <w:tcBorders>
-              <w:top w:val="single" w:color="BFBFBF" w:sz="4"/>
-              <w:left w:val="single" w:color="BFBFBF" w:sz="4"/>
-              <w:bottom w:val="single" w:color="BFBFBF" w:sz="4"/>
-              <w:right w:val="single" w:color="BFBFBF" w:sz="4"/>
-            </w:tcBorders>
-            <w:tcMar>
-              <w:top w:type="dxa" w:w="60"/>
-              <w:left w:type="dxa" w:w="90"/>
-              <w:bottom w:type="dxa" w:w="60"/>
-              <w:right w:type="dxa" w:w="90"/>
-            </w:tcMar>
-          </w:tcPr>
-          <w:p>
-            <w:pPr>
-              <w:spacing w:after="20"/>
-            </w:pPr>
-            <w:r>
-              <w:rPr>
-                <w:rFonts w:ascii="Arial" w:cs="Arial" w:eastAsia="Arial" w:hAnsi="Arial"/>
-                <w:b w:val="false"/>
-                <w:bCs w:val="false"/>
-                <w:sz w:val="18"/>
-                <w:szCs w:val="18"/>
-              </w:rPr>
-              <w:t xml:space="preserve">POS-03/04/05 thêm/sửa/xóa dòng; POS-07 đổi trạng thái; POS-09 hủy; POS-11 in bill</w:t>
-            </w:r>
-          </w:p>
-        </w:tc>
-        <w:tc>
-          <w:tcPr>
-            <w:tcW w:type="dxa" w:w="1400"/>
-            <w:tcBorders>
-              <w:top w:val="single" w:color="BFBFBF" w:sz="4"/>
-              <w:left w:val="single" w:color="BFBFBF" w:sz="4"/>
-              <w:bottom w:val="single" w:color="BFBFBF" w:sz="4"/>
-              <w:right w:val="single" w:color="BFBFBF" w:sz="4"/>
-            </w:tcBorders>
-            <w:tcMar>
-              <w:top w:type="dxa" w:w="60"/>
-              <w:left w:type="dxa" w:w="90"/>
-              <w:bottom w:type="dxa" w:w="60"/>
-              <w:right w:type="dxa" w:w="90"/>
-            </w:tcMar>
-          </w:tcPr>
-          <w:p>
-            <w:pPr>
-              <w:spacing w:after="20"/>
-            </w:pPr>
-            <w:r>
-              <w:rPr>
-                <w:rFonts w:ascii="Arial" w:cs="Arial" w:eastAsia="Arial" w:hAnsi="Arial"/>
-                <w:b w:val="false"/>
-                <w:bCs w:val="false"/>
-                <w:sz w:val="18"/>
-                <w:szCs w:val="18"/>
-              </w:rPr>
-              <w:t xml:space="preserve">5 + 2 + 2 + 3</w:t>
+            <w:tcW w:type="dxa" w:w="1900"/>
+            <w:tcBorders>
+              <w:top w:val="single" w:color="BFBFBF" w:sz="4"/>
+              <w:left w:val="single" w:color="BFBFBF" w:sz="4"/>
+              <w:bottom w:val="single" w:color="BFBFBF" w:sz="4"/>
+              <w:right w:val="single" w:color="BFBFBF" w:sz="4"/>
+            </w:tcBorders>
+            <w:tcMar>
+              <w:top w:type="dxa" w:w="60"/>
+              <w:left w:type="dxa" w:w="90"/>
+              <w:bottom w:type="dxa" w:w="60"/>
+              <w:right w:type="dxa" w:w="90"/>
+            </w:tcMar>
+          </w:tcPr>
+          <w:p>
+            <w:pPr>
+              <w:spacing w:after="20"/>
+            </w:pPr>
+            <w:r>
+              <w:rPr>
+                <w:rFonts w:ascii="Arial" w:cs="Arial" w:eastAsia="Arial" w:hAnsi="Arial"/>
+                <w:b w:val="false"/>
+                <w:bCs w:val="false"/>
+                <w:sz w:val="18"/>
+                <w:szCs w:val="18"/>
+              </w:rPr>
+              <w:t xml:space="preserve">Order cơ bản</w:t>
+            </w:r>
+          </w:p>
+        </w:tc>
+        <w:tc>
+          <w:tcPr>
+            <w:tcW w:type="dxa" w:w="2100"/>
+            <w:tcBorders>
+              <w:top w:val="single" w:color="BFBFBF" w:sz="4"/>
+              <w:left w:val="single" w:color="BFBFBF" w:sz="4"/>
+              <w:bottom w:val="single" w:color="BFBFBF" w:sz="4"/>
+              <w:right w:val="single" w:color="BFBFBF" w:sz="4"/>
+            </w:tcBorders>
+            <w:tcMar>
+              <w:top w:type="dxa" w:w="60"/>
+              <w:left w:type="dxa" w:w="90"/>
+              <w:bottom w:type="dxa" w:w="60"/>
+              <w:right w:type="dxa" w:w="90"/>
+            </w:tcMar>
+          </w:tcPr>
+          <w:p>
+            <w:pPr>
+              <w:spacing w:after="20"/>
+            </w:pPr>
+            <w:r>
+              <w:rPr>
+                <w:rFonts w:ascii="Arial" w:cs="Arial" w:eastAsia="Arial" w:hAnsi="Arial"/>
+                <w:b w:val="false"/>
+                <w:bCs w:val="false"/>
+                <w:sz w:val="18"/>
+                <w:szCs w:val="18"/>
+              </w:rPr>
+              <w:t xml:space="preserve">CN-09, CN-03</w:t>
+            </w:r>
+          </w:p>
+        </w:tc>
+        <w:tc>
+          <w:tcPr>
+            <w:tcW w:type="dxa" w:w="8678"/>
+            <w:tcBorders>
+              <w:top w:val="single" w:color="BFBFBF" w:sz="4"/>
+              <w:left w:val="single" w:color="BFBFBF" w:sz="4"/>
+              <w:bottom w:val="single" w:color="BFBFBF" w:sz="4"/>
+              <w:right w:val="single" w:color="BFBFBF" w:sz="4"/>
+            </w:tcBorders>
+            <w:tcMar>
+              <w:top w:type="dxa" w:w="60"/>
+              <w:left w:type="dxa" w:w="90"/>
+              <w:bottom w:type="dxa" w:w="60"/>
+              <w:right w:type="dxa" w:w="90"/>
+            </w:tcMar>
+          </w:tcPr>
+          <w:p>
+            <w:pPr>
+              <w:spacing w:after="20"/>
+            </w:pPr>
+            <w:r>
+              <w:rPr>
+                <w:rFonts w:ascii="Arial" w:cs="Arial" w:eastAsia="Arial" w:hAnsi="Arial"/>
+                <w:b w:val="false"/>
+                <w:bCs w:val="false"/>
+                <w:sz w:val="18"/>
+                <w:szCs w:val="18"/>
+              </w:rPr>
+              <w:t xml:space="preserve">POS-01 xem menu; POS-02 tạo order; POS-10 danh sách order</w:t>
+            </w:r>
+          </w:p>
+        </w:tc>
+        <w:tc>
+          <w:tcPr>
+            <w:tcW w:type="dxa" w:w="2000"/>
+            <w:tcBorders>
+              <w:top w:val="single" w:color="BFBFBF" w:sz="4"/>
+              <w:left w:val="single" w:color="BFBFBF" w:sz="4"/>
+              <w:bottom w:val="single" w:color="BFBFBF" w:sz="4"/>
+              <w:right w:val="single" w:color="BFBFBF" w:sz="4"/>
+            </w:tcBorders>
+            <w:tcMar>
+              <w:top w:type="dxa" w:w="60"/>
+              <w:left w:type="dxa" w:w="90"/>
+              <w:bottom w:type="dxa" w:w="60"/>
+              <w:right w:type="dxa" w:w="90"/>
+            </w:tcMar>
+          </w:tcPr>
+          <w:p>
+            <w:pPr>
+              <w:spacing w:after="20"/>
+            </w:pPr>
+            <w:r>
+              <w:rPr>
+                <w:rFonts w:ascii="Arial" w:cs="Arial" w:eastAsia="Arial" w:hAnsi="Arial"/>
+                <w:b w:val="false"/>
+                <w:bCs w:val="false"/>
+                <w:sz w:val="18"/>
+                <w:szCs w:val="18"/>
+              </w:rPr>
+              <w:t xml:space="preserve">2 + 8 + 3</w:t>
             </w:r>
           </w:p>
         </w:tc>
@@ -1523,97 +1707,129 @@
         </w:trPr>
         <w:tc>
           <w:tcPr>
-            <w:tcW w:type="dxa" w:w="2400"/>
-            <w:tcBorders>
-              <w:top w:val="single" w:color="BFBFBF" w:sz="4"/>
-              <w:left w:val="single" w:color="BFBFBF" w:sz="4"/>
-              <w:bottom w:val="single" w:color="BFBFBF" w:sz="4"/>
-              <w:right w:val="single" w:color="BFBFBF" w:sz="4"/>
-            </w:tcBorders>
-            <w:tcMar>
-              <w:top w:type="dxa" w:w="60"/>
-              <w:left w:type="dxa" w:w="90"/>
-              <w:bottom w:type="dxa" w:w="60"/>
-              <w:right w:type="dxa" w:w="90"/>
-            </w:tcMar>
-          </w:tcPr>
-          <w:p>
-            <w:pPr>
-              <w:spacing w:after="20"/>
-            </w:pPr>
-            <w:r>
-              <w:rPr>
-                <w:rFonts w:ascii="Arial" w:cs="Arial" w:eastAsia="Arial" w:hAnsi="Arial"/>
-                <w:b w:val="false"/>
-                <w:bCs w:val="false"/>
-                <w:sz w:val="18"/>
-                <w:szCs w:val="18"/>
-              </w:rPr>
-              <w:t xml:space="preserve">Thanh toán</w:t>
-            </w:r>
-          </w:p>
-        </w:tc>
-        <w:tc>
-          <w:tcPr>
-            <w:tcW w:type="dxa" w:w="10878"/>
-            <w:tcBorders>
-              <w:top w:val="single" w:color="BFBFBF" w:sz="4"/>
-              <w:left w:val="single" w:color="BFBFBF" w:sz="4"/>
-              <w:bottom w:val="single" w:color="BFBFBF" w:sz="4"/>
-              <w:right w:val="single" w:color="BFBFBF" w:sz="4"/>
-            </w:tcBorders>
-            <w:tcMar>
-              <w:top w:type="dxa" w:w="60"/>
-              <w:left w:type="dxa" w:w="90"/>
-              <w:bottom w:type="dxa" w:w="60"/>
-              <w:right w:type="dxa" w:w="90"/>
-            </w:tcMar>
-          </w:tcPr>
-          <w:p>
-            <w:pPr>
-              <w:spacing w:after="20"/>
-            </w:pPr>
-            <w:r>
-              <w:rPr>
-                <w:rFonts w:ascii="Arial" w:cs="Arial" w:eastAsia="Arial" w:hAnsi="Arial"/>
-                <w:b w:val="false"/>
-                <w:bCs w:val="false"/>
-                <w:sz w:val="18"/>
-                <w:szCs w:val="18"/>
-              </w:rPr>
-              <w:t xml:space="preserve">POS-08 thanh toán; cộng điểm; trừ kho</w:t>
-            </w:r>
-          </w:p>
-        </w:tc>
-        <w:tc>
-          <w:tcPr>
-            <w:tcW w:type="dxa" w:w="1400"/>
-            <w:tcBorders>
-              <w:top w:val="single" w:color="BFBFBF" w:sz="4"/>
-              <w:left w:val="single" w:color="BFBFBF" w:sz="4"/>
-              <w:bottom w:val="single" w:color="BFBFBF" w:sz="4"/>
-              <w:right w:val="single" w:color="BFBFBF" w:sz="4"/>
-            </w:tcBorders>
-            <w:tcMar>
-              <w:top w:type="dxa" w:w="60"/>
-              <w:left w:type="dxa" w:w="90"/>
-              <w:bottom w:type="dxa" w:w="60"/>
-              <w:right w:type="dxa" w:w="90"/>
-            </w:tcMar>
-          </w:tcPr>
-          <w:p>
-            <w:pPr>
-              <w:spacing w:after="20"/>
-            </w:pPr>
-            <w:r>
-              <w:rPr>
-                <w:rFonts w:ascii="Arial" w:cs="Arial" w:eastAsia="Arial" w:hAnsi="Arial"/>
-                <w:b w:val="false"/>
-                <w:bCs w:val="false"/>
-                <w:sz w:val="18"/>
-                <w:szCs w:val="18"/>
-              </w:rPr>
-              <w:t xml:space="preserve">5 + 2 + 5</w:t>
+            <w:tcW w:type="dxa" w:w="1900"/>
+            <w:tcBorders>
+              <w:top w:val="single" w:color="BFBFBF" w:sz="4"/>
+              <w:left w:val="single" w:color="BFBFBF" w:sz="4"/>
+              <w:bottom w:val="single" w:color="BFBFBF" w:sz="4"/>
+              <w:right w:val="single" w:color="BFBFBF" w:sz="4"/>
+            </w:tcBorders>
+            <w:tcMar>
+              <w:top w:type="dxa" w:w="60"/>
+              <w:left w:type="dxa" w:w="90"/>
+              <w:bottom w:type="dxa" w:w="60"/>
+              <w:right w:type="dxa" w:w="90"/>
+            </w:tcMar>
+          </w:tcPr>
+          <w:p>
+            <w:pPr>
+              <w:spacing w:after="20"/>
+            </w:pPr>
+            <w:r>
+              <w:rPr>
+                <w:rFonts w:ascii="Arial" w:cs="Arial" w:eastAsia="Arial" w:hAnsi="Arial"/>
+                <w:b w:val="false"/>
+                <w:bCs w:val="false"/>
+                <w:sz w:val="18"/>
+                <w:szCs w:val="18"/>
+              </w:rPr>
+              <w:t xml:space="preserve">Sửa order</w:t>
+            </w:r>
+          </w:p>
+        </w:tc>
+        <w:tc>
+          <w:tcPr>
+            <w:tcW w:type="dxa" w:w="2100"/>
+            <w:tcBorders>
+              <w:top w:val="single" w:color="BFBFBF" w:sz="4"/>
+              <w:left w:val="single" w:color="BFBFBF" w:sz="4"/>
+              <w:bottom w:val="single" w:color="BFBFBF" w:sz="4"/>
+              <w:right w:val="single" w:color="BFBFBF" w:sz="4"/>
+            </w:tcBorders>
+            <w:tcMar>
+              <w:top w:type="dxa" w:w="60"/>
+              <w:left w:type="dxa" w:w="90"/>
+              <w:bottom w:type="dxa" w:w="60"/>
+              <w:right w:type="dxa" w:w="90"/>
+            </w:tcMar>
+          </w:tcPr>
+          <w:p>
+            <w:pPr>
+              <w:spacing w:after="20"/>
+            </w:pPr>
+            <w:r>
+              <w:rPr>
+                <w:rFonts w:ascii="Arial" w:cs="Arial" w:eastAsia="Arial" w:hAnsi="Arial"/>
+                <w:b w:val="false"/>
+                <w:bCs w:val="false"/>
+                <w:sz w:val="18"/>
+                <w:szCs w:val="18"/>
+              </w:rPr>
+              <w:t xml:space="preserve">CN-09, CN-03</w:t>
+            </w:r>
+          </w:p>
+        </w:tc>
+        <w:tc>
+          <w:tcPr>
+            <w:tcW w:type="dxa" w:w="8678"/>
+            <w:tcBorders>
+              <w:top w:val="single" w:color="BFBFBF" w:sz="4"/>
+              <w:left w:val="single" w:color="BFBFBF" w:sz="4"/>
+              <w:bottom w:val="single" w:color="BFBFBF" w:sz="4"/>
+              <w:right w:val="single" w:color="BFBFBF" w:sz="4"/>
+            </w:tcBorders>
+            <w:tcMar>
+              <w:top w:type="dxa" w:w="60"/>
+              <w:left w:type="dxa" w:w="90"/>
+              <w:bottom w:type="dxa" w:w="60"/>
+              <w:right w:type="dxa" w:w="90"/>
+            </w:tcMar>
+          </w:tcPr>
+          <w:p>
+            <w:pPr>
+              <w:spacing w:after="20"/>
+            </w:pPr>
+            <w:r>
+              <w:rPr>
+                <w:rFonts w:ascii="Arial" w:cs="Arial" w:eastAsia="Arial" w:hAnsi="Arial"/>
+                <w:b w:val="false"/>
+                <w:bCs w:val="false"/>
+                <w:sz w:val="18"/>
+                <w:szCs w:val="18"/>
+              </w:rPr>
+              <w:t xml:space="preserve">POS-03/04/05 thêm, sửa, xóa dòng; POS-07 đổi trạng thái; POS-09 hủy; POS-11 xem và in hóa đơn</w:t>
+            </w:r>
+          </w:p>
+        </w:tc>
+        <w:tc>
+          <w:tcPr>
+            <w:tcW w:type="dxa" w:w="2000"/>
+            <w:tcBorders>
+              <w:top w:val="single" w:color="BFBFBF" w:sz="4"/>
+              <w:left w:val="single" w:color="BFBFBF" w:sz="4"/>
+              <w:bottom w:val="single" w:color="BFBFBF" w:sz="4"/>
+              <w:right w:val="single" w:color="BFBFBF" w:sz="4"/>
+            </w:tcBorders>
+            <w:tcMar>
+              <w:top w:type="dxa" w:w="60"/>
+              <w:left w:type="dxa" w:w="90"/>
+              <w:bottom w:type="dxa" w:w="60"/>
+              <w:right w:type="dxa" w:w="90"/>
+            </w:tcMar>
+          </w:tcPr>
+          <w:p>
+            <w:pPr>
+              <w:spacing w:after="20"/>
+            </w:pPr>
+            <w:r>
+              <w:rPr>
+                <w:rFonts w:ascii="Arial" w:cs="Arial" w:eastAsia="Arial" w:hAnsi="Arial"/>
+                <w:b w:val="false"/>
+                <w:bCs w:val="false"/>
+                <w:sz w:val="18"/>
+                <w:szCs w:val="18"/>
+              </w:rPr>
+              <w:t xml:space="preserve">5 + 2 + 2 + 3</w:t>
             </w:r>
           </w:p>
         </w:tc>
@@ -1624,97 +1840,129 @@
         </w:trPr>
         <w:tc>
           <w:tcPr>
-            <w:tcW w:type="dxa" w:w="2400"/>
-            <w:tcBorders>
-              <w:top w:val="single" w:color="BFBFBF" w:sz="4"/>
-              <w:left w:val="single" w:color="BFBFBF" w:sz="4"/>
-              <w:bottom w:val="single" w:color="BFBFBF" w:sz="4"/>
-              <w:right w:val="single" w:color="BFBFBF" w:sz="4"/>
-            </w:tcBorders>
-            <w:tcMar>
-              <w:top w:type="dxa" w:w="60"/>
-              <w:left w:type="dxa" w:w="90"/>
-              <w:bottom w:type="dxa" w:w="60"/>
-              <w:right w:type="dxa" w:w="90"/>
-            </w:tcMar>
-          </w:tcPr>
-          <w:p>
-            <w:pPr>
-              <w:spacing w:after="20"/>
-            </w:pPr>
-            <w:r>
-              <w:rPr>
-                <w:rFonts w:ascii="Arial" w:cs="Arial" w:eastAsia="Arial" w:hAnsi="Arial"/>
-                <w:b w:val="false"/>
-                <w:bCs w:val="false"/>
-                <w:sz w:val="18"/>
-                <w:szCs w:val="18"/>
-              </w:rPr>
-              <w:t xml:space="preserve">Khách hàng</w:t>
-            </w:r>
-          </w:p>
-        </w:tc>
-        <w:tc>
-          <w:tcPr>
-            <w:tcW w:type="dxa" w:w="10878"/>
-            <w:tcBorders>
-              <w:top w:val="single" w:color="BFBFBF" w:sz="4"/>
-              <w:left w:val="single" w:color="BFBFBF" w:sz="4"/>
-              <w:bottom w:val="single" w:color="BFBFBF" w:sz="4"/>
-              <w:right w:val="single" w:color="BFBFBF" w:sz="4"/>
-            </w:tcBorders>
-            <w:tcMar>
-              <w:top w:type="dxa" w:w="60"/>
-              <w:left w:type="dxa" w:w="90"/>
-              <w:bottom w:type="dxa" w:w="60"/>
-              <w:right w:type="dxa" w:w="90"/>
-            </w:tcMar>
-          </w:tcPr>
-          <w:p>
-            <w:pPr>
-              <w:spacing w:after="20"/>
-            </w:pPr>
-            <w:r>
-              <w:rPr>
-                <w:rFonts w:ascii="Arial" w:cs="Arial" w:eastAsia="Arial" w:hAnsi="Arial"/>
-                <w:b w:val="false"/>
-                <w:bCs w:val="false"/>
-                <w:sz w:val="18"/>
-                <w:szCs w:val="18"/>
-              </w:rPr>
-              <w:t xml:space="preserve">KH-01, KH-03, POS-06 gắn khách; KH-02, KH-04; KH-05 top khách</w:t>
-            </w:r>
-          </w:p>
-        </w:tc>
-        <w:tc>
-          <w:tcPr>
-            <w:tcW w:type="dxa" w:w="1400"/>
-            <w:tcBorders>
-              <w:top w:val="single" w:color="BFBFBF" w:sz="4"/>
-              <w:left w:val="single" w:color="BFBFBF" w:sz="4"/>
-              <w:bottom w:val="single" w:color="BFBFBF" w:sz="4"/>
-              <w:right w:val="single" w:color="BFBFBF" w:sz="4"/>
-            </w:tcBorders>
-            <w:tcMar>
-              <w:top w:type="dxa" w:w="60"/>
-              <w:left w:type="dxa" w:w="90"/>
-              <w:bottom w:type="dxa" w:w="60"/>
-              <w:right w:type="dxa" w:w="90"/>
-            </w:tcMar>
-          </w:tcPr>
-          <w:p>
-            <w:pPr>
-              <w:spacing w:after="20"/>
-            </w:pPr>
-            <w:r>
-              <w:rPr>
-                <w:rFonts w:ascii="Arial" w:cs="Arial" w:eastAsia="Arial" w:hAnsi="Arial"/>
-                <w:b w:val="false"/>
-                <w:bCs w:val="false"/>
-                <w:sz w:val="18"/>
-                <w:szCs w:val="18"/>
-              </w:rPr>
-              <w:t xml:space="preserve">2 + 2 + 2 + 3 + 2</w:t>
+            <w:tcW w:type="dxa" w:w="1900"/>
+            <w:tcBorders>
+              <w:top w:val="single" w:color="BFBFBF" w:sz="4"/>
+              <w:left w:val="single" w:color="BFBFBF" w:sz="4"/>
+              <w:bottom w:val="single" w:color="BFBFBF" w:sz="4"/>
+              <w:right w:val="single" w:color="BFBFBF" w:sz="4"/>
+            </w:tcBorders>
+            <w:tcMar>
+              <w:top w:type="dxa" w:w="60"/>
+              <w:left w:type="dxa" w:w="90"/>
+              <w:bottom w:type="dxa" w:w="60"/>
+              <w:right w:type="dxa" w:w="90"/>
+            </w:tcMar>
+          </w:tcPr>
+          <w:p>
+            <w:pPr>
+              <w:spacing w:after="20"/>
+            </w:pPr>
+            <w:r>
+              <w:rPr>
+                <w:rFonts w:ascii="Arial" w:cs="Arial" w:eastAsia="Arial" w:hAnsi="Arial"/>
+                <w:b w:val="false"/>
+                <w:bCs w:val="false"/>
+                <w:sz w:val="18"/>
+                <w:szCs w:val="18"/>
+              </w:rPr>
+              <w:t xml:space="preserve">Thanh toán</w:t>
+            </w:r>
+          </w:p>
+        </w:tc>
+        <w:tc>
+          <w:tcPr>
+            <w:tcW w:type="dxa" w:w="2100"/>
+            <w:tcBorders>
+              <w:top w:val="single" w:color="BFBFBF" w:sz="4"/>
+              <w:left w:val="single" w:color="BFBFBF" w:sz="4"/>
+              <w:bottom w:val="single" w:color="BFBFBF" w:sz="4"/>
+              <w:right w:val="single" w:color="BFBFBF" w:sz="4"/>
+            </w:tcBorders>
+            <w:tcMar>
+              <w:top w:type="dxa" w:w="60"/>
+              <w:left w:type="dxa" w:w="90"/>
+              <w:bottom w:type="dxa" w:w="60"/>
+              <w:right w:type="dxa" w:w="90"/>
+            </w:tcMar>
+          </w:tcPr>
+          <w:p>
+            <w:pPr>
+              <w:spacing w:after="20"/>
+            </w:pPr>
+            <w:r>
+              <w:rPr>
+                <w:rFonts w:ascii="Arial" w:cs="Arial" w:eastAsia="Arial" w:hAnsi="Arial"/>
+                <w:b w:val="false"/>
+                <w:bCs w:val="false"/>
+                <w:sz w:val="18"/>
+                <w:szCs w:val="18"/>
+              </w:rPr>
+              <w:t xml:space="preserve">CN-03</w:t>
+            </w:r>
+          </w:p>
+        </w:tc>
+        <w:tc>
+          <w:tcPr>
+            <w:tcW w:type="dxa" w:w="8678"/>
+            <w:tcBorders>
+              <w:top w:val="single" w:color="BFBFBF" w:sz="4"/>
+              <w:left w:val="single" w:color="BFBFBF" w:sz="4"/>
+              <w:bottom w:val="single" w:color="BFBFBF" w:sz="4"/>
+              <w:right w:val="single" w:color="BFBFBF" w:sz="4"/>
+            </w:tcBorders>
+            <w:tcMar>
+              <w:top w:type="dxa" w:w="60"/>
+              <w:left w:type="dxa" w:w="90"/>
+              <w:bottom w:type="dxa" w:w="60"/>
+              <w:right w:type="dxa" w:w="90"/>
+            </w:tcMar>
+          </w:tcPr>
+          <w:p>
+            <w:pPr>
+              <w:spacing w:after="20"/>
+            </w:pPr>
+            <w:r>
+              <w:rPr>
+                <w:rFonts w:ascii="Arial" w:cs="Arial" w:eastAsia="Arial" w:hAnsi="Arial"/>
+                <w:b w:val="false"/>
+                <w:bCs w:val="false"/>
+                <w:sz w:val="18"/>
+                <w:szCs w:val="18"/>
+              </w:rPr>
+              <w:t xml:space="preserve">POS-08 thanh toán; cộng điểm tích lũy</w:t>
+            </w:r>
+          </w:p>
+        </w:tc>
+        <w:tc>
+          <w:tcPr>
+            <w:tcW w:type="dxa" w:w="2000"/>
+            <w:tcBorders>
+              <w:top w:val="single" w:color="BFBFBF" w:sz="4"/>
+              <w:left w:val="single" w:color="BFBFBF" w:sz="4"/>
+              <w:bottom w:val="single" w:color="BFBFBF" w:sz="4"/>
+              <w:right w:val="single" w:color="BFBFBF" w:sz="4"/>
+            </w:tcBorders>
+            <w:tcMar>
+              <w:top w:type="dxa" w:w="60"/>
+              <w:left w:type="dxa" w:w="90"/>
+              <w:bottom w:type="dxa" w:w="60"/>
+              <w:right w:type="dxa" w:w="90"/>
+            </w:tcMar>
+          </w:tcPr>
+          <w:p>
+            <w:pPr>
+              <w:spacing w:after="20"/>
+            </w:pPr>
+            <w:r>
+              <w:rPr>
+                <w:rFonts w:ascii="Arial" w:cs="Arial" w:eastAsia="Arial" w:hAnsi="Arial"/>
+                <w:b w:val="false"/>
+                <w:bCs w:val="false"/>
+                <w:sz w:val="18"/>
+                <w:szCs w:val="18"/>
+              </w:rPr>
+              <w:t xml:space="preserve">5 + 2</w:t>
             </w:r>
           </w:p>
         </w:tc>
@@ -1725,97 +1973,129 @@
         </w:trPr>
         <w:tc>
           <w:tcPr>
-            <w:tcW w:type="dxa" w:w="2400"/>
-            <w:tcBorders>
-              <w:top w:val="single" w:color="BFBFBF" w:sz="4"/>
-              <w:left w:val="single" w:color="BFBFBF" w:sz="4"/>
-              <w:bottom w:val="single" w:color="BFBFBF" w:sz="4"/>
-              <w:right w:val="single" w:color="BFBFBF" w:sz="4"/>
-            </w:tcBorders>
-            <w:tcMar>
-              <w:top w:type="dxa" w:w="60"/>
-              <w:left w:type="dxa" w:w="90"/>
-              <w:bottom w:type="dxa" w:w="60"/>
-              <w:right w:type="dxa" w:w="90"/>
-            </w:tcMar>
-          </w:tcPr>
-          <w:p>
-            <w:pPr>
-              <w:spacing w:after="20"/>
-            </w:pPr>
-            <w:r>
-              <w:rPr>
-                <w:rFonts w:ascii="Arial" w:cs="Arial" w:eastAsia="Arial" w:hAnsi="Arial"/>
-                <w:b w:val="false"/>
-                <w:bCs w:val="false"/>
-                <w:sz w:val="18"/>
-                <w:szCs w:val="18"/>
-              </w:rPr>
-              <w:t xml:space="preserve">Khuyến mãi</w:t>
-            </w:r>
-          </w:p>
-        </w:tc>
-        <w:tc>
-          <w:tcPr>
-            <w:tcW w:type="dxa" w:w="10878"/>
-            <w:tcBorders>
-              <w:top w:val="single" w:color="BFBFBF" w:sz="4"/>
-              <w:left w:val="single" w:color="BFBFBF" w:sz="4"/>
-              <w:bottom w:val="single" w:color="BFBFBF" w:sz="4"/>
-              <w:right w:val="single" w:color="BFBFBF" w:sz="4"/>
-            </w:tcBorders>
-            <w:tcMar>
-              <w:top w:type="dxa" w:w="60"/>
-              <w:left w:type="dxa" w:w="90"/>
-              <w:bottom w:type="dxa" w:w="60"/>
-              <w:right w:type="dxa" w:w="90"/>
-            </w:tcMar>
-          </w:tcPr>
-          <w:p>
-            <w:pPr>
-              <w:spacing w:after="20"/>
-            </w:pPr>
-            <w:r>
-              <w:rPr>
-                <w:rFonts w:ascii="Arial" w:cs="Arial" w:eastAsia="Arial" w:hAnsi="Arial"/>
-                <w:b w:val="false"/>
-                <w:bCs w:val="false"/>
-                <w:sz w:val="18"/>
-                <w:szCs w:val="18"/>
-              </w:rPr>
-              <w:t xml:space="preserve">KM-01…KM-06; áp khuyến mãi tự động vào POS; KM-07 báo cáo</w:t>
-            </w:r>
-          </w:p>
-        </w:tc>
-        <w:tc>
-          <w:tcPr>
-            <w:tcW w:type="dxa" w:w="1400"/>
-            <w:tcBorders>
-              <w:top w:val="single" w:color="BFBFBF" w:sz="4"/>
-              <w:left w:val="single" w:color="BFBFBF" w:sz="4"/>
-              <w:bottom w:val="single" w:color="BFBFBF" w:sz="4"/>
-              <w:right w:val="single" w:color="BFBFBF" w:sz="4"/>
-            </w:tcBorders>
-            <w:tcMar>
-              <w:top w:type="dxa" w:w="60"/>
-              <w:left w:type="dxa" w:w="90"/>
-              <w:bottom w:type="dxa" w:w="60"/>
-              <w:right w:type="dxa" w:w="90"/>
-            </w:tcMar>
-          </w:tcPr>
-          <w:p>
-            <w:pPr>
-              <w:spacing w:after="20"/>
-            </w:pPr>
-            <w:r>
-              <w:rPr>
-                <w:rFonts w:ascii="Arial" w:cs="Arial" w:eastAsia="Arial" w:hAnsi="Arial"/>
-                <w:b w:val="false"/>
-                <w:bCs w:val="false"/>
-                <w:sz w:val="18"/>
-                <w:szCs w:val="18"/>
-              </w:rPr>
-              <w:t xml:space="preserve">10 + 5 + 3</w:t>
+            <w:tcW w:type="dxa" w:w="1900"/>
+            <w:tcBorders>
+              <w:top w:val="single" w:color="BFBFBF" w:sz="4"/>
+              <w:left w:val="single" w:color="BFBFBF" w:sz="4"/>
+              <w:bottom w:val="single" w:color="BFBFBF" w:sz="4"/>
+              <w:right w:val="single" w:color="BFBFBF" w:sz="4"/>
+            </w:tcBorders>
+            <w:tcMar>
+              <w:top w:type="dxa" w:w="60"/>
+              <w:left w:type="dxa" w:w="90"/>
+              <w:bottom w:type="dxa" w:w="60"/>
+              <w:right w:type="dxa" w:w="90"/>
+            </w:tcMar>
+          </w:tcPr>
+          <w:p>
+            <w:pPr>
+              <w:spacing w:after="20"/>
+            </w:pPr>
+            <w:r>
+              <w:rPr>
+                <w:rFonts w:ascii="Arial" w:cs="Arial" w:eastAsia="Arial" w:hAnsi="Arial"/>
+                <w:b w:val="false"/>
+                <w:bCs w:val="false"/>
+                <w:sz w:val="18"/>
+                <w:szCs w:val="18"/>
+              </w:rPr>
+              <w:t xml:space="preserve">Trừ kho</w:t>
+            </w:r>
+          </w:p>
+        </w:tc>
+        <w:tc>
+          <w:tcPr>
+            <w:tcW w:type="dxa" w:w="2100"/>
+            <w:tcBorders>
+              <w:top w:val="single" w:color="BFBFBF" w:sz="4"/>
+              <w:left w:val="single" w:color="BFBFBF" w:sz="4"/>
+              <w:bottom w:val="single" w:color="BFBFBF" w:sz="4"/>
+              <w:right w:val="single" w:color="BFBFBF" w:sz="4"/>
+            </w:tcBorders>
+            <w:tcMar>
+              <w:top w:type="dxa" w:w="60"/>
+              <w:left w:type="dxa" w:w="90"/>
+              <w:bottom w:type="dxa" w:w="60"/>
+              <w:right w:type="dxa" w:w="90"/>
+            </w:tcMar>
+          </w:tcPr>
+          <w:p>
+            <w:pPr>
+              <w:spacing w:after="20"/>
+            </w:pPr>
+            <w:r>
+              <w:rPr>
+                <w:rFonts w:ascii="Arial" w:cs="Arial" w:eastAsia="Arial" w:hAnsi="Arial"/>
+                <w:b w:val="false"/>
+                <w:bCs w:val="false"/>
+                <w:sz w:val="18"/>
+                <w:szCs w:val="18"/>
+              </w:rPr>
+              <w:t xml:space="preserve">CN-09, CN-10</w:t>
+            </w:r>
+          </w:p>
+        </w:tc>
+        <w:tc>
+          <w:tcPr>
+            <w:tcW w:type="dxa" w:w="8678"/>
+            <w:tcBorders>
+              <w:top w:val="single" w:color="BFBFBF" w:sz="4"/>
+              <w:left w:val="single" w:color="BFBFBF" w:sz="4"/>
+              <w:bottom w:val="single" w:color="BFBFBF" w:sz="4"/>
+              <w:right w:val="single" w:color="BFBFBF" w:sz="4"/>
+            </w:tcBorders>
+            <w:tcMar>
+              <w:top w:type="dxa" w:w="60"/>
+              <w:left w:type="dxa" w:w="90"/>
+              <w:bottom w:type="dxa" w:w="60"/>
+              <w:right w:type="dxa" w:w="90"/>
+            </w:tcMar>
+          </w:tcPr>
+          <w:p>
+            <w:pPr>
+              <w:spacing w:after="20"/>
+            </w:pPr>
+            <w:r>
+              <w:rPr>
+                <w:rFonts w:ascii="Arial" w:cs="Arial" w:eastAsia="Arial" w:hAnsi="Arial"/>
+                <w:b w:val="false"/>
+                <w:bCs w:val="false"/>
+                <w:sz w:val="18"/>
+                <w:szCs w:val="18"/>
+              </w:rPr>
+              <w:t xml:space="preserve">Trừ nguyên liệu khi gọi món, trả lại khi bỏ món chưa làm hoặc hủy order (thanh toán không đụng đến kho)</w:t>
+            </w:r>
+          </w:p>
+        </w:tc>
+        <w:tc>
+          <w:tcPr>
+            <w:tcW w:type="dxa" w:w="2000"/>
+            <w:tcBorders>
+              <w:top w:val="single" w:color="BFBFBF" w:sz="4"/>
+              <w:left w:val="single" w:color="BFBFBF" w:sz="4"/>
+              <w:bottom w:val="single" w:color="BFBFBF" w:sz="4"/>
+              <w:right w:val="single" w:color="BFBFBF" w:sz="4"/>
+            </w:tcBorders>
+            <w:tcMar>
+              <w:top w:type="dxa" w:w="60"/>
+              <w:left w:type="dxa" w:w="90"/>
+              <w:bottom w:type="dxa" w:w="60"/>
+              <w:right w:type="dxa" w:w="90"/>
+            </w:tcMar>
+          </w:tcPr>
+          <w:p>
+            <w:pPr>
+              <w:spacing w:after="20"/>
+            </w:pPr>
+            <w:r>
+              <w:rPr>
+                <w:rFonts w:ascii="Arial" w:cs="Arial" w:eastAsia="Arial" w:hAnsi="Arial"/>
+                <w:b w:val="false"/>
+                <w:bCs w:val="false"/>
+                <w:sz w:val="18"/>
+                <w:szCs w:val="18"/>
+              </w:rPr>
+              <w:t xml:space="preserve">5</w:t>
             </w:r>
           </w:p>
         </w:tc>
@@ -1826,97 +2106,129 @@
         </w:trPr>
         <w:tc>
           <w:tcPr>
-            <w:tcW w:type="dxa" w:w="2400"/>
-            <w:tcBorders>
-              <w:top w:val="single" w:color="BFBFBF" w:sz="4"/>
-              <w:left w:val="single" w:color="BFBFBF" w:sz="4"/>
-              <w:bottom w:val="single" w:color="BFBFBF" w:sz="4"/>
-              <w:right w:val="single" w:color="BFBFBF" w:sz="4"/>
-            </w:tcBorders>
-            <w:tcMar>
-              <w:top w:type="dxa" w:w="60"/>
-              <w:left w:type="dxa" w:w="90"/>
-              <w:bottom w:type="dxa" w:w="60"/>
-              <w:right w:type="dxa" w:w="90"/>
-            </w:tcMar>
-          </w:tcPr>
-          <w:p>
-            <w:pPr>
-              <w:spacing w:after="20"/>
-            </w:pPr>
-            <w:r>
-              <w:rPr>
-                <w:rFonts w:ascii="Arial" w:cs="Arial" w:eastAsia="Arial" w:hAnsi="Arial"/>
-                <w:b w:val="false"/>
-                <w:bCs w:val="false"/>
-                <w:sz w:val="18"/>
-                <w:szCs w:val="18"/>
-              </w:rPr>
-              <w:t xml:space="preserve">Kho</w:t>
-            </w:r>
-          </w:p>
-        </w:tc>
-        <w:tc>
-          <w:tcPr>
-            <w:tcW w:type="dxa" w:w="10878"/>
-            <w:tcBorders>
-              <w:top w:val="single" w:color="BFBFBF" w:sz="4"/>
-              <w:left w:val="single" w:color="BFBFBF" w:sz="4"/>
-              <w:bottom w:val="single" w:color="BFBFBF" w:sz="4"/>
-              <w:right w:val="single" w:color="BFBFBF" w:sz="4"/>
-            </w:tcBorders>
-            <w:tcMar>
-              <w:top w:type="dxa" w:w="60"/>
-              <w:left w:type="dxa" w:w="90"/>
-              <w:bottom w:type="dxa" w:w="60"/>
-              <w:right w:type="dxa" w:w="90"/>
-            </w:tcMar>
-          </w:tcPr>
-          <w:p>
-            <w:pPr>
-              <w:spacing w:after="20"/>
-            </w:pPr>
-            <w:r>
-              <w:rPr>
-                <w:rFonts w:ascii="Arial" w:cs="Arial" w:eastAsia="Arial" w:hAnsi="Arial"/>
-                <w:b w:val="false"/>
-                <w:bCs w:val="false"/>
-                <w:sz w:val="18"/>
-                <w:szCs w:val="18"/>
-              </w:rPr>
-              <w:t xml:space="preserve">KHO-01…KHO-05; KHO-06 cảnh báo</w:t>
-            </w:r>
-          </w:p>
-        </w:tc>
-        <w:tc>
-          <w:tcPr>
-            <w:tcW w:type="dxa" w:w="1400"/>
-            <w:tcBorders>
-              <w:top w:val="single" w:color="BFBFBF" w:sz="4"/>
-              <w:left w:val="single" w:color="BFBFBF" w:sz="4"/>
-              <w:bottom w:val="single" w:color="BFBFBF" w:sz="4"/>
-              <w:right w:val="single" w:color="BFBFBF" w:sz="4"/>
-            </w:tcBorders>
-            <w:tcMar>
-              <w:top w:type="dxa" w:w="60"/>
-              <w:left w:type="dxa" w:w="90"/>
-              <w:bottom w:type="dxa" w:w="60"/>
-              <w:right w:type="dxa" w:w="90"/>
-            </w:tcMar>
-          </w:tcPr>
-          <w:p>
-            <w:pPr>
-              <w:spacing w:after="20"/>
-            </w:pPr>
-            <w:r>
-              <w:rPr>
-                <w:rFonts w:ascii="Arial" w:cs="Arial" w:eastAsia="Arial" w:hAnsi="Arial"/>
-                <w:b w:val="false"/>
-                <w:bCs w:val="false"/>
-                <w:sz w:val="18"/>
-                <w:szCs w:val="18"/>
-              </w:rPr>
-              <w:t xml:space="preserve">14 + 3</w:t>
+            <w:tcW w:type="dxa" w:w="1900"/>
+            <w:tcBorders>
+              <w:top w:val="single" w:color="BFBFBF" w:sz="4"/>
+              <w:left w:val="single" w:color="BFBFBF" w:sz="4"/>
+              <w:bottom w:val="single" w:color="BFBFBF" w:sz="4"/>
+              <w:right w:val="single" w:color="BFBFBF" w:sz="4"/>
+            </w:tcBorders>
+            <w:tcMar>
+              <w:top w:type="dxa" w:w="60"/>
+              <w:left w:type="dxa" w:w="90"/>
+              <w:bottom w:type="dxa" w:w="60"/>
+              <w:right w:type="dxa" w:w="90"/>
+            </w:tcMar>
+          </w:tcPr>
+          <w:p>
+            <w:pPr>
+              <w:spacing w:after="20"/>
+            </w:pPr>
+            <w:r>
+              <w:rPr>
+                <w:rFonts w:ascii="Arial" w:cs="Arial" w:eastAsia="Arial" w:hAnsi="Arial"/>
+                <w:b w:val="false"/>
+                <w:bCs w:val="false"/>
+                <w:sz w:val="18"/>
+                <w:szCs w:val="18"/>
+              </w:rPr>
+              <w:t xml:space="preserve">Khách hàng</w:t>
+            </w:r>
+          </w:p>
+        </w:tc>
+        <w:tc>
+          <w:tcPr>
+            <w:tcW w:type="dxa" w:w="2100"/>
+            <w:tcBorders>
+              <w:top w:val="single" w:color="BFBFBF" w:sz="4"/>
+              <w:left w:val="single" w:color="BFBFBF" w:sz="4"/>
+              <w:bottom w:val="single" w:color="BFBFBF" w:sz="4"/>
+              <w:right w:val="single" w:color="BFBFBF" w:sz="4"/>
+            </w:tcBorders>
+            <w:tcMar>
+              <w:top w:type="dxa" w:w="60"/>
+              <w:left w:type="dxa" w:w="90"/>
+              <w:bottom w:type="dxa" w:w="60"/>
+              <w:right w:type="dxa" w:w="90"/>
+            </w:tcMar>
+          </w:tcPr>
+          <w:p>
+            <w:pPr>
+              <w:spacing w:after="20"/>
+            </w:pPr>
+            <w:r>
+              <w:rPr>
+                <w:rFonts w:ascii="Arial" w:cs="Arial" w:eastAsia="Arial" w:hAnsi="Arial"/>
+                <w:b w:val="false"/>
+                <w:bCs w:val="false"/>
+                <w:sz w:val="18"/>
+                <w:szCs w:val="18"/>
+              </w:rPr>
+              <w:t xml:space="preserve">CN-05</w:t>
+            </w:r>
+          </w:p>
+        </w:tc>
+        <w:tc>
+          <w:tcPr>
+            <w:tcW w:type="dxa" w:w="8678"/>
+            <w:tcBorders>
+              <w:top w:val="single" w:color="BFBFBF" w:sz="4"/>
+              <w:left w:val="single" w:color="BFBFBF" w:sz="4"/>
+              <w:bottom w:val="single" w:color="BFBFBF" w:sz="4"/>
+              <w:right w:val="single" w:color="BFBFBF" w:sz="4"/>
+            </w:tcBorders>
+            <w:tcMar>
+              <w:top w:type="dxa" w:w="60"/>
+              <w:left w:type="dxa" w:w="90"/>
+              <w:bottom w:type="dxa" w:w="60"/>
+              <w:right w:type="dxa" w:w="90"/>
+            </w:tcMar>
+          </w:tcPr>
+          <w:p>
+            <w:pPr>
+              <w:spacing w:after="20"/>
+            </w:pPr>
+            <w:r>
+              <w:rPr>
+                <w:rFonts w:ascii="Arial" w:cs="Arial" w:eastAsia="Arial" w:hAnsi="Arial"/>
+                <w:b w:val="false"/>
+                <w:bCs w:val="false"/>
+                <w:sz w:val="18"/>
+                <w:szCs w:val="18"/>
+              </w:rPr>
+              <w:t xml:space="preserve">KH-01, KH-03, POS-06 gắn khách; KH-02, KH-04; KH-05 top khách</w:t>
+            </w:r>
+          </w:p>
+        </w:tc>
+        <w:tc>
+          <w:tcPr>
+            <w:tcW w:type="dxa" w:w="2000"/>
+            <w:tcBorders>
+              <w:top w:val="single" w:color="BFBFBF" w:sz="4"/>
+              <w:left w:val="single" w:color="BFBFBF" w:sz="4"/>
+              <w:bottom w:val="single" w:color="BFBFBF" w:sz="4"/>
+              <w:right w:val="single" w:color="BFBFBF" w:sz="4"/>
+            </w:tcBorders>
+            <w:tcMar>
+              <w:top w:type="dxa" w:w="60"/>
+              <w:left w:type="dxa" w:w="90"/>
+              <w:bottom w:type="dxa" w:w="60"/>
+              <w:right w:type="dxa" w:w="90"/>
+            </w:tcMar>
+          </w:tcPr>
+          <w:p>
+            <w:pPr>
+              <w:spacing w:after="20"/>
+            </w:pPr>
+            <w:r>
+              <w:rPr>
+                <w:rFonts w:ascii="Arial" w:cs="Arial" w:eastAsia="Arial" w:hAnsi="Arial"/>
+                <w:b w:val="false"/>
+                <w:bCs w:val="false"/>
+                <w:sz w:val="18"/>
+                <w:szCs w:val="18"/>
+              </w:rPr>
+              <w:t xml:space="preserve">2 + 2 + 2 + 3 + 2</w:t>
             </w:r>
           </w:p>
         </w:tc>
@@ -1927,97 +2239,129 @@
         </w:trPr>
         <w:tc>
           <w:tcPr>
-            <w:tcW w:type="dxa" w:w="2400"/>
-            <w:tcBorders>
-              <w:top w:val="single" w:color="BFBFBF" w:sz="4"/>
-              <w:left w:val="single" w:color="BFBFBF" w:sz="4"/>
-              <w:bottom w:val="single" w:color="BFBFBF" w:sz="4"/>
-              <w:right w:val="single" w:color="BFBFBF" w:sz="4"/>
-            </w:tcBorders>
-            <w:tcMar>
-              <w:top w:type="dxa" w:w="60"/>
-              <w:left w:type="dxa" w:w="90"/>
-              <w:bottom w:type="dxa" w:w="60"/>
-              <w:right w:type="dxa" w:w="90"/>
-            </w:tcMar>
-          </w:tcPr>
-          <w:p>
-            <w:pPr>
-              <w:spacing w:after="20"/>
-            </w:pPr>
-            <w:r>
-              <w:rPr>
-                <w:rFonts w:ascii="Arial" w:cs="Arial" w:eastAsia="Arial" w:hAnsi="Arial"/>
-                <w:b w:val="false"/>
-                <w:bCs w:val="false"/>
-                <w:sz w:val="18"/>
-                <w:szCs w:val="18"/>
-              </w:rPr>
-              <w:t xml:space="preserve">Nhân sự</w:t>
-            </w:r>
-          </w:p>
-        </w:tc>
-        <w:tc>
-          <w:tcPr>
-            <w:tcW w:type="dxa" w:w="10878"/>
-            <w:tcBorders>
-              <w:top w:val="single" w:color="BFBFBF" w:sz="4"/>
-              <w:left w:val="single" w:color="BFBFBF" w:sz="4"/>
-              <w:bottom w:val="single" w:color="BFBFBF" w:sz="4"/>
-              <w:right w:val="single" w:color="BFBFBF" w:sz="4"/>
-            </w:tcBorders>
-            <w:tcMar>
-              <w:top w:type="dxa" w:w="60"/>
-              <w:left w:type="dxa" w:w="90"/>
-              <w:bottom w:type="dxa" w:w="60"/>
-              <w:right w:type="dxa" w:w="90"/>
-            </w:tcMar>
-          </w:tcPr>
-          <w:p>
-            <w:pPr>
-              <w:spacing w:after="20"/>
-            </w:pPr>
-            <w:r>
-              <w:rPr>
-                <w:rFonts w:ascii="Arial" w:cs="Arial" w:eastAsia="Arial" w:hAnsi="Arial"/>
-                <w:b w:val="false"/>
-                <w:bCs w:val="false"/>
-                <w:sz w:val="18"/>
-                <w:szCs w:val="18"/>
-              </w:rPr>
-              <w:t xml:space="preserve">NS-01…NS-07; AUTH-02 đổi mật khẩu</w:t>
-            </w:r>
-          </w:p>
-        </w:tc>
-        <w:tc>
-          <w:tcPr>
-            <w:tcW w:type="dxa" w:w="1400"/>
-            <w:tcBorders>
-              <w:top w:val="single" w:color="BFBFBF" w:sz="4"/>
-              <w:left w:val="single" w:color="BFBFBF" w:sz="4"/>
-              <w:bottom w:val="single" w:color="BFBFBF" w:sz="4"/>
-              <w:right w:val="single" w:color="BFBFBF" w:sz="4"/>
-            </w:tcBorders>
-            <w:tcMar>
-              <w:top w:type="dxa" w:w="60"/>
-              <w:left w:type="dxa" w:w="90"/>
-              <w:bottom w:type="dxa" w:w="60"/>
-              <w:right w:type="dxa" w:w="90"/>
-            </w:tcMar>
-          </w:tcPr>
-          <w:p>
-            <w:pPr>
-              <w:spacing w:after="20"/>
-            </w:pPr>
-            <w:r>
-              <w:rPr>
-                <w:rFonts w:ascii="Arial" w:cs="Arial" w:eastAsia="Arial" w:hAnsi="Arial"/>
-                <w:b w:val="false"/>
-                <w:bCs w:val="false"/>
-                <w:sz w:val="18"/>
-                <w:szCs w:val="18"/>
-              </w:rPr>
-              <w:t xml:space="preserve">17 + 2</w:t>
+            <w:tcW w:type="dxa" w:w="1900"/>
+            <w:tcBorders>
+              <w:top w:val="single" w:color="BFBFBF" w:sz="4"/>
+              <w:left w:val="single" w:color="BFBFBF" w:sz="4"/>
+              <w:bottom w:val="single" w:color="BFBFBF" w:sz="4"/>
+              <w:right w:val="single" w:color="BFBFBF" w:sz="4"/>
+            </w:tcBorders>
+            <w:tcMar>
+              <w:top w:type="dxa" w:w="60"/>
+              <w:left w:type="dxa" w:w="90"/>
+              <w:bottom w:type="dxa" w:w="60"/>
+              <w:right w:type="dxa" w:w="90"/>
+            </w:tcMar>
+          </w:tcPr>
+          <w:p>
+            <w:pPr>
+              <w:spacing w:after="20"/>
+            </w:pPr>
+            <w:r>
+              <w:rPr>
+                <w:rFonts w:ascii="Arial" w:cs="Arial" w:eastAsia="Arial" w:hAnsi="Arial"/>
+                <w:b w:val="false"/>
+                <w:bCs w:val="false"/>
+                <w:sz w:val="18"/>
+                <w:szCs w:val="18"/>
+              </w:rPr>
+              <w:t xml:space="preserve">Khuyến mãi</w:t>
+            </w:r>
+          </w:p>
+        </w:tc>
+        <w:tc>
+          <w:tcPr>
+            <w:tcW w:type="dxa" w:w="2100"/>
+            <w:tcBorders>
+              <w:top w:val="single" w:color="BFBFBF" w:sz="4"/>
+              <w:left w:val="single" w:color="BFBFBF" w:sz="4"/>
+              <w:bottom w:val="single" w:color="BFBFBF" w:sz="4"/>
+              <w:right w:val="single" w:color="BFBFBF" w:sz="4"/>
+            </w:tcBorders>
+            <w:tcMar>
+              <w:top w:type="dxa" w:w="60"/>
+              <w:left w:type="dxa" w:w="90"/>
+              <w:bottom w:type="dxa" w:w="60"/>
+              <w:right w:type="dxa" w:w="90"/>
+            </w:tcMar>
+          </w:tcPr>
+          <w:p>
+            <w:pPr>
+              <w:spacing w:after="20"/>
+            </w:pPr>
+            <w:r>
+              <w:rPr>
+                <w:rFonts w:ascii="Arial" w:cs="Arial" w:eastAsia="Arial" w:hAnsi="Arial"/>
+                <w:b w:val="false"/>
+                <w:bCs w:val="false"/>
+                <w:sz w:val="18"/>
+                <w:szCs w:val="18"/>
+              </w:rPr>
+              <w:t xml:space="preserve">CN-04, CN-09</w:t>
+            </w:r>
+          </w:p>
+        </w:tc>
+        <w:tc>
+          <w:tcPr>
+            <w:tcW w:type="dxa" w:w="8678"/>
+            <w:tcBorders>
+              <w:top w:val="single" w:color="BFBFBF" w:sz="4"/>
+              <w:left w:val="single" w:color="BFBFBF" w:sz="4"/>
+              <w:bottom w:val="single" w:color="BFBFBF" w:sz="4"/>
+              <w:right w:val="single" w:color="BFBFBF" w:sz="4"/>
+            </w:tcBorders>
+            <w:tcMar>
+              <w:top w:type="dxa" w:w="60"/>
+              <w:left w:type="dxa" w:w="90"/>
+              <w:bottom w:type="dxa" w:w="60"/>
+              <w:right w:type="dxa" w:w="90"/>
+            </w:tcMar>
+          </w:tcPr>
+          <w:p>
+            <w:pPr>
+              <w:spacing w:after="20"/>
+            </w:pPr>
+            <w:r>
+              <w:rPr>
+                <w:rFonts w:ascii="Arial" w:cs="Arial" w:eastAsia="Arial" w:hAnsi="Arial"/>
+                <w:b w:val="false"/>
+                <w:bCs w:val="false"/>
+                <w:sz w:val="18"/>
+                <w:szCs w:val="18"/>
+              </w:rPr>
+              <w:t xml:space="preserve">KM-01…KM-06; áp khuyến mãi tự động vào order; KM-07 báo cáo hiệu quả</w:t>
+            </w:r>
+          </w:p>
+        </w:tc>
+        <w:tc>
+          <w:tcPr>
+            <w:tcW w:type="dxa" w:w="2000"/>
+            <w:tcBorders>
+              <w:top w:val="single" w:color="BFBFBF" w:sz="4"/>
+              <w:left w:val="single" w:color="BFBFBF" w:sz="4"/>
+              <w:bottom w:val="single" w:color="BFBFBF" w:sz="4"/>
+              <w:right w:val="single" w:color="BFBFBF" w:sz="4"/>
+            </w:tcBorders>
+            <w:tcMar>
+              <w:top w:type="dxa" w:w="60"/>
+              <w:left w:type="dxa" w:w="90"/>
+              <w:bottom w:type="dxa" w:w="60"/>
+              <w:right w:type="dxa" w:w="90"/>
+            </w:tcMar>
+          </w:tcPr>
+          <w:p>
+            <w:pPr>
+              <w:spacing w:after="20"/>
+            </w:pPr>
+            <w:r>
+              <w:rPr>
+                <w:rFonts w:ascii="Arial" w:cs="Arial" w:eastAsia="Arial" w:hAnsi="Arial"/>
+                <w:b w:val="false"/>
+                <w:bCs w:val="false"/>
+                <w:sz w:val="18"/>
+                <w:szCs w:val="18"/>
+              </w:rPr>
+              <w:t xml:space="preserve">10 + 5 + 3</w:t>
             </w:r>
           </w:p>
         </w:tc>
@@ -2028,97 +2372,129 @@
         </w:trPr>
         <w:tc>
           <w:tcPr>
-            <w:tcW w:type="dxa" w:w="2400"/>
-            <w:tcBorders>
-              <w:top w:val="single" w:color="BFBFBF" w:sz="4"/>
-              <w:left w:val="single" w:color="BFBFBF" w:sz="4"/>
-              <w:bottom w:val="single" w:color="BFBFBF" w:sz="4"/>
-              <w:right w:val="single" w:color="BFBFBF" w:sz="4"/>
-            </w:tcBorders>
-            <w:tcMar>
-              <w:top w:type="dxa" w:w="60"/>
-              <w:left w:type="dxa" w:w="90"/>
-              <w:bottom w:type="dxa" w:w="60"/>
-              <w:right w:type="dxa" w:w="90"/>
-            </w:tcMar>
-          </w:tcPr>
-          <w:p>
-            <w:pPr>
-              <w:spacing w:after="20"/>
-            </w:pPr>
-            <w:r>
-              <w:rPr>
-                <w:rFonts w:ascii="Arial" w:cs="Arial" w:eastAsia="Arial" w:hAnsi="Arial"/>
-                <w:b w:val="false"/>
-                <w:bCs w:val="false"/>
-                <w:sz w:val="18"/>
-                <w:szCs w:val="18"/>
-              </w:rPr>
-              <w:t xml:space="preserve">Báo cáo</w:t>
-            </w:r>
-          </w:p>
-        </w:tc>
-        <w:tc>
-          <w:tcPr>
-            <w:tcW w:type="dxa" w:w="10878"/>
-            <w:tcBorders>
-              <w:top w:val="single" w:color="BFBFBF" w:sz="4"/>
-              <w:left w:val="single" w:color="BFBFBF" w:sz="4"/>
-              <w:bottom w:val="single" w:color="BFBFBF" w:sz="4"/>
-              <w:right w:val="single" w:color="BFBFBF" w:sz="4"/>
-            </w:tcBorders>
-            <w:tcMar>
-              <w:top w:type="dxa" w:w="60"/>
-              <w:left w:type="dxa" w:w="90"/>
-              <w:bottom w:type="dxa" w:w="60"/>
-              <w:right w:type="dxa" w:w="90"/>
-            </w:tcMar>
-          </w:tcPr>
-          <w:p>
-            <w:pPr>
-              <w:spacing w:after="20"/>
-            </w:pPr>
-            <w:r>
-              <w:rPr>
-                <w:rFonts w:ascii="Arial" w:cs="Arial" w:eastAsia="Arial" w:hAnsi="Arial"/>
-                <w:b w:val="false"/>
-                <w:bCs w:val="false"/>
-                <w:sz w:val="18"/>
-                <w:szCs w:val="18"/>
-              </w:rPr>
-              <w:t xml:space="preserve">BC-01…BC-06</w:t>
-            </w:r>
-          </w:p>
-        </w:tc>
-        <w:tc>
-          <w:tcPr>
-            <w:tcW w:type="dxa" w:w="1400"/>
-            <w:tcBorders>
-              <w:top w:val="single" w:color="BFBFBF" w:sz="4"/>
-              <w:left w:val="single" w:color="BFBFBF" w:sz="4"/>
-              <w:bottom w:val="single" w:color="BFBFBF" w:sz="4"/>
-              <w:right w:val="single" w:color="BFBFBF" w:sz="4"/>
-            </w:tcBorders>
-            <w:tcMar>
-              <w:top w:type="dxa" w:w="60"/>
-              <w:left w:type="dxa" w:w="90"/>
-              <w:bottom w:type="dxa" w:w="60"/>
-              <w:right w:type="dxa" w:w="90"/>
-            </w:tcMar>
-          </w:tcPr>
-          <w:p>
-            <w:pPr>
-              <w:spacing w:after="20"/>
-            </w:pPr>
-            <w:r>
-              <w:rPr>
-                <w:rFonts w:ascii="Arial" w:cs="Arial" w:eastAsia="Arial" w:hAnsi="Arial"/>
-                <w:b w:val="false"/>
-                <w:bCs w:val="false"/>
-                <w:sz w:val="18"/>
-                <w:szCs w:val="18"/>
-              </w:rPr>
-              <w:t xml:space="preserve">13</w:t>
+            <w:tcW w:type="dxa" w:w="1900"/>
+            <w:tcBorders>
+              <w:top w:val="single" w:color="BFBFBF" w:sz="4"/>
+              <w:left w:val="single" w:color="BFBFBF" w:sz="4"/>
+              <w:bottom w:val="single" w:color="BFBFBF" w:sz="4"/>
+              <w:right w:val="single" w:color="BFBFBF" w:sz="4"/>
+            </w:tcBorders>
+            <w:tcMar>
+              <w:top w:type="dxa" w:w="60"/>
+              <w:left w:type="dxa" w:w="90"/>
+              <w:bottom w:type="dxa" w:w="60"/>
+              <w:right w:type="dxa" w:w="90"/>
+            </w:tcMar>
+          </w:tcPr>
+          <w:p>
+            <w:pPr>
+              <w:spacing w:after="20"/>
+            </w:pPr>
+            <w:r>
+              <w:rPr>
+                <w:rFonts w:ascii="Arial" w:cs="Arial" w:eastAsia="Arial" w:hAnsi="Arial"/>
+                <w:b w:val="false"/>
+                <w:bCs w:val="false"/>
+                <w:sz w:val="18"/>
+                <w:szCs w:val="18"/>
+              </w:rPr>
+              <w:t xml:space="preserve">Kho</w:t>
+            </w:r>
+          </w:p>
+        </w:tc>
+        <w:tc>
+          <w:tcPr>
+            <w:tcW w:type="dxa" w:w="2100"/>
+            <w:tcBorders>
+              <w:top w:val="single" w:color="BFBFBF" w:sz="4"/>
+              <w:left w:val="single" w:color="BFBFBF" w:sz="4"/>
+              <w:bottom w:val="single" w:color="BFBFBF" w:sz="4"/>
+              <w:right w:val="single" w:color="BFBFBF" w:sz="4"/>
+            </w:tcBorders>
+            <w:tcMar>
+              <w:top w:type="dxa" w:w="60"/>
+              <w:left w:type="dxa" w:w="90"/>
+              <w:bottom w:type="dxa" w:w="60"/>
+              <w:right w:type="dxa" w:w="90"/>
+            </w:tcMar>
+          </w:tcPr>
+          <w:p>
+            <w:pPr>
+              <w:spacing w:after="20"/>
+            </w:pPr>
+            <w:r>
+              <w:rPr>
+                <w:rFonts w:ascii="Arial" w:cs="Arial" w:eastAsia="Arial" w:hAnsi="Arial"/>
+                <w:b w:val="false"/>
+                <w:bCs w:val="false"/>
+                <w:sz w:val="18"/>
+                <w:szCs w:val="18"/>
+              </w:rPr>
+              <w:t xml:space="preserve">CN-06, CN-08, CN-10</w:t>
+            </w:r>
+          </w:p>
+        </w:tc>
+        <w:tc>
+          <w:tcPr>
+            <w:tcW w:type="dxa" w:w="8678"/>
+            <w:tcBorders>
+              <w:top w:val="single" w:color="BFBFBF" w:sz="4"/>
+              <w:left w:val="single" w:color="BFBFBF" w:sz="4"/>
+              <w:bottom w:val="single" w:color="BFBFBF" w:sz="4"/>
+              <w:right w:val="single" w:color="BFBFBF" w:sz="4"/>
+            </w:tcBorders>
+            <w:tcMar>
+              <w:top w:type="dxa" w:w="60"/>
+              <w:left w:type="dxa" w:w="90"/>
+              <w:bottom w:type="dxa" w:w="60"/>
+              <w:right w:type="dxa" w:w="90"/>
+            </w:tcMar>
+          </w:tcPr>
+          <w:p>
+            <w:pPr>
+              <w:spacing w:after="20"/>
+            </w:pPr>
+            <w:r>
+              <w:rPr>
+                <w:rFonts w:ascii="Arial" w:cs="Arial" w:eastAsia="Arial" w:hAnsi="Arial"/>
+                <w:b w:val="false"/>
+                <w:bCs w:val="false"/>
+                <w:sz w:val="18"/>
+                <w:szCs w:val="18"/>
+              </w:rPr>
+              <w:t xml:space="preserve">KHO-01…KHO-05 nguyên liệu, nhà cung cấp, công thức, nhập hàng; KHO-06 tồn kho và cảnh báo</w:t>
+            </w:r>
+          </w:p>
+        </w:tc>
+        <w:tc>
+          <w:tcPr>
+            <w:tcW w:type="dxa" w:w="2000"/>
+            <w:tcBorders>
+              <w:top w:val="single" w:color="BFBFBF" w:sz="4"/>
+              <w:left w:val="single" w:color="BFBFBF" w:sz="4"/>
+              <w:bottom w:val="single" w:color="BFBFBF" w:sz="4"/>
+              <w:right w:val="single" w:color="BFBFBF" w:sz="4"/>
+            </w:tcBorders>
+            <w:tcMar>
+              <w:top w:type="dxa" w:w="60"/>
+              <w:left w:type="dxa" w:w="90"/>
+              <w:bottom w:type="dxa" w:w="60"/>
+              <w:right w:type="dxa" w:w="90"/>
+            </w:tcMar>
+          </w:tcPr>
+          <w:p>
+            <w:pPr>
+              <w:spacing w:after="20"/>
+            </w:pPr>
+            <w:r>
+              <w:rPr>
+                <w:rFonts w:ascii="Arial" w:cs="Arial" w:eastAsia="Arial" w:hAnsi="Arial"/>
+                <w:b w:val="false"/>
+                <w:bCs w:val="false"/>
+                <w:sz w:val="18"/>
+                <w:szCs w:val="18"/>
+              </w:rPr>
+              <w:t xml:space="preserve">14 + 3</w:t>
             </w:r>
           </w:p>
         </w:tc>
@@ -2129,7 +2505,273 @@
         </w:trPr>
         <w:tc>
           <w:tcPr>
-            <w:tcW w:type="dxa" w:w="2400"/>
+            <w:tcW w:type="dxa" w:w="1900"/>
+            <w:tcBorders>
+              <w:top w:val="single" w:color="BFBFBF" w:sz="4"/>
+              <w:left w:val="single" w:color="BFBFBF" w:sz="4"/>
+              <w:bottom w:val="single" w:color="BFBFBF" w:sz="4"/>
+              <w:right w:val="single" w:color="BFBFBF" w:sz="4"/>
+            </w:tcBorders>
+            <w:tcMar>
+              <w:top w:type="dxa" w:w="60"/>
+              <w:left w:type="dxa" w:w="90"/>
+              <w:bottom w:type="dxa" w:w="60"/>
+              <w:right w:type="dxa" w:w="90"/>
+            </w:tcMar>
+          </w:tcPr>
+          <w:p>
+            <w:pPr>
+              <w:spacing w:after="20"/>
+            </w:pPr>
+            <w:r>
+              <w:rPr>
+                <w:rFonts w:ascii="Arial" w:cs="Arial" w:eastAsia="Arial" w:hAnsi="Arial"/>
+                <w:b w:val="false"/>
+                <w:bCs w:val="false"/>
+                <w:sz w:val="18"/>
+                <w:szCs w:val="18"/>
+              </w:rPr>
+              <w:t xml:space="preserve">Nhân sự</w:t>
+            </w:r>
+          </w:p>
+        </w:tc>
+        <w:tc>
+          <w:tcPr>
+            <w:tcW w:type="dxa" w:w="2100"/>
+            <w:tcBorders>
+              <w:top w:val="single" w:color="BFBFBF" w:sz="4"/>
+              <w:left w:val="single" w:color="BFBFBF" w:sz="4"/>
+              <w:bottom w:val="single" w:color="BFBFBF" w:sz="4"/>
+              <w:right w:val="single" w:color="BFBFBF" w:sz="4"/>
+            </w:tcBorders>
+            <w:tcMar>
+              <w:top w:type="dxa" w:w="60"/>
+              <w:left w:type="dxa" w:w="90"/>
+              <w:bottom w:type="dxa" w:w="60"/>
+              <w:right w:type="dxa" w:w="90"/>
+            </w:tcMar>
+          </w:tcPr>
+          <w:p>
+            <w:pPr>
+              <w:spacing w:after="20"/>
+            </w:pPr>
+            <w:r>
+              <w:rPr>
+                <w:rFonts w:ascii="Arial" w:cs="Arial" w:eastAsia="Arial" w:hAnsi="Arial"/>
+                <w:b w:val="false"/>
+                <w:bCs w:val="false"/>
+                <w:sz w:val="18"/>
+                <w:szCs w:val="18"/>
+              </w:rPr>
+              <w:t xml:space="preserve">CN-07</w:t>
+            </w:r>
+          </w:p>
+        </w:tc>
+        <w:tc>
+          <w:tcPr>
+            <w:tcW w:type="dxa" w:w="8678"/>
+            <w:tcBorders>
+              <w:top w:val="single" w:color="BFBFBF" w:sz="4"/>
+              <w:left w:val="single" w:color="BFBFBF" w:sz="4"/>
+              <w:bottom w:val="single" w:color="BFBFBF" w:sz="4"/>
+              <w:right w:val="single" w:color="BFBFBF" w:sz="4"/>
+            </w:tcBorders>
+            <w:tcMar>
+              <w:top w:type="dxa" w:w="60"/>
+              <w:left w:type="dxa" w:w="90"/>
+              <w:bottom w:type="dxa" w:w="60"/>
+              <w:right w:type="dxa" w:w="90"/>
+            </w:tcMar>
+          </w:tcPr>
+          <w:p>
+            <w:pPr>
+              <w:spacing w:after="20"/>
+            </w:pPr>
+            <w:r>
+              <w:rPr>
+                <w:rFonts w:ascii="Arial" w:cs="Arial" w:eastAsia="Arial" w:hAnsi="Arial"/>
+                <w:b w:val="false"/>
+                <w:bCs w:val="false"/>
+                <w:sz w:val="18"/>
+                <w:szCs w:val="18"/>
+              </w:rPr>
+              <w:t xml:space="preserve">NS-01…NS-07 nhân viên, ca, xếp lịch, lịch tuần</w:t>
+            </w:r>
+          </w:p>
+        </w:tc>
+        <w:tc>
+          <w:tcPr>
+            <w:tcW w:type="dxa" w:w="2000"/>
+            <w:tcBorders>
+              <w:top w:val="single" w:color="BFBFBF" w:sz="4"/>
+              <w:left w:val="single" w:color="BFBFBF" w:sz="4"/>
+              <w:bottom w:val="single" w:color="BFBFBF" w:sz="4"/>
+              <w:right w:val="single" w:color="BFBFBF" w:sz="4"/>
+            </w:tcBorders>
+            <w:tcMar>
+              <w:top w:type="dxa" w:w="60"/>
+              <w:left w:type="dxa" w:w="90"/>
+              <w:bottom w:type="dxa" w:w="60"/>
+              <w:right w:type="dxa" w:w="90"/>
+            </w:tcMar>
+          </w:tcPr>
+          <w:p>
+            <w:pPr>
+              <w:spacing w:after="20"/>
+            </w:pPr>
+            <w:r>
+              <w:rPr>
+                <w:rFonts w:ascii="Arial" w:cs="Arial" w:eastAsia="Arial" w:hAnsi="Arial"/>
+                <w:b w:val="false"/>
+                <w:bCs w:val="false"/>
+                <w:sz w:val="18"/>
+                <w:szCs w:val="18"/>
+              </w:rPr>
+              <w:t xml:space="preserve">17</w:t>
+            </w:r>
+          </w:p>
+        </w:tc>
+      </w:tr>
+      <w:tr>
+        <w:trPr>
+          <w:cantSplit/>
+        </w:trPr>
+        <w:tc>
+          <w:tcPr>
+            <w:tcW w:type="dxa" w:w="1900"/>
+            <w:tcBorders>
+              <w:top w:val="single" w:color="BFBFBF" w:sz="4"/>
+              <w:left w:val="single" w:color="BFBFBF" w:sz="4"/>
+              <w:bottom w:val="single" w:color="BFBFBF" w:sz="4"/>
+              <w:right w:val="single" w:color="BFBFBF" w:sz="4"/>
+            </w:tcBorders>
+            <w:tcMar>
+              <w:top w:type="dxa" w:w="60"/>
+              <w:left w:type="dxa" w:w="90"/>
+              <w:bottom w:type="dxa" w:w="60"/>
+              <w:right w:type="dxa" w:w="90"/>
+            </w:tcMar>
+          </w:tcPr>
+          <w:p>
+            <w:pPr>
+              <w:spacing w:after="20"/>
+            </w:pPr>
+            <w:r>
+              <w:rPr>
+                <w:rFonts w:ascii="Arial" w:cs="Arial" w:eastAsia="Arial" w:hAnsi="Arial"/>
+                <w:b w:val="false"/>
+                <w:bCs w:val="false"/>
+                <w:sz w:val="18"/>
+                <w:szCs w:val="18"/>
+              </w:rPr>
+              <w:t xml:space="preserve">Báo cáo</w:t>
+            </w:r>
+          </w:p>
+        </w:tc>
+        <w:tc>
+          <w:tcPr>
+            <w:tcW w:type="dxa" w:w="2100"/>
+            <w:tcBorders>
+              <w:top w:val="single" w:color="BFBFBF" w:sz="4"/>
+              <w:left w:val="single" w:color="BFBFBF" w:sz="4"/>
+              <w:bottom w:val="single" w:color="BFBFBF" w:sz="4"/>
+              <w:right w:val="single" w:color="BFBFBF" w:sz="4"/>
+            </w:tcBorders>
+            <w:tcMar>
+              <w:top w:type="dxa" w:w="60"/>
+              <w:left w:type="dxa" w:w="90"/>
+              <w:bottom w:type="dxa" w:w="60"/>
+              <w:right w:type="dxa" w:w="90"/>
+            </w:tcMar>
+          </w:tcPr>
+          <w:p>
+            <w:pPr>
+              <w:spacing w:after="20"/>
+            </w:pPr>
+            <w:r>
+              <w:rPr>
+                <w:rFonts w:ascii="Arial" w:cs="Arial" w:eastAsia="Arial" w:hAnsi="Arial"/>
+                <w:b w:val="false"/>
+                <w:bCs w:val="false"/>
+                <w:sz w:val="18"/>
+                <w:szCs w:val="18"/>
+              </w:rPr>
+              <w:t xml:space="preserve">CN-11</w:t>
+            </w:r>
+          </w:p>
+        </w:tc>
+        <w:tc>
+          <w:tcPr>
+            <w:tcW w:type="dxa" w:w="8678"/>
+            <w:tcBorders>
+              <w:top w:val="single" w:color="BFBFBF" w:sz="4"/>
+              <w:left w:val="single" w:color="BFBFBF" w:sz="4"/>
+              <w:bottom w:val="single" w:color="BFBFBF" w:sz="4"/>
+              <w:right w:val="single" w:color="BFBFBF" w:sz="4"/>
+            </w:tcBorders>
+            <w:tcMar>
+              <w:top w:type="dxa" w:w="60"/>
+              <w:left w:type="dxa" w:w="90"/>
+              <w:bottom w:type="dxa" w:w="60"/>
+              <w:right w:type="dxa" w:w="90"/>
+            </w:tcMar>
+          </w:tcPr>
+          <w:p>
+            <w:pPr>
+              <w:spacing w:after="20"/>
+            </w:pPr>
+            <w:r>
+              <w:rPr>
+                <w:rFonts w:ascii="Arial" w:cs="Arial" w:eastAsia="Arial" w:hAnsi="Arial"/>
+                <w:b w:val="false"/>
+                <w:bCs w:val="false"/>
+                <w:sz w:val="18"/>
+                <w:szCs w:val="18"/>
+              </w:rPr>
+              <w:t xml:space="preserve">BC-01…BC-06</w:t>
+            </w:r>
+          </w:p>
+        </w:tc>
+        <w:tc>
+          <w:tcPr>
+            <w:tcW w:type="dxa" w:w="2000"/>
+            <w:tcBorders>
+              <w:top w:val="single" w:color="BFBFBF" w:sz="4"/>
+              <w:left w:val="single" w:color="BFBFBF" w:sz="4"/>
+              <w:bottom w:val="single" w:color="BFBFBF" w:sz="4"/>
+              <w:right w:val="single" w:color="BFBFBF" w:sz="4"/>
+            </w:tcBorders>
+            <w:tcMar>
+              <w:top w:type="dxa" w:w="60"/>
+              <w:left w:type="dxa" w:w="90"/>
+              <w:bottom w:type="dxa" w:w="60"/>
+              <w:right w:type="dxa" w:w="90"/>
+            </w:tcMar>
+          </w:tcPr>
+          <w:p>
+            <w:pPr>
+              <w:spacing w:after="20"/>
+            </w:pPr>
+            <w:r>
+              <w:rPr>
+                <w:rFonts w:ascii="Arial" w:cs="Arial" w:eastAsia="Arial" w:hAnsi="Arial"/>
+                <w:b w:val="false"/>
+                <w:bCs w:val="false"/>
+                <w:sz w:val="18"/>
+                <w:szCs w:val="18"/>
+              </w:rPr>
+              <w:t xml:space="preserve">13</w:t>
+            </w:r>
+          </w:p>
+        </w:tc>
+      </w:tr>
+      <w:tr>
+        <w:trPr>
+          <w:cantSplit/>
+        </w:trPr>
+        <w:tc>
+          <w:tcPr>
+            <w:tcW w:type="dxa" w:w="1900"/>
             <w:tcBorders>
               <w:top w:val="single" w:color="BFBFBF" w:sz="4"/>
               <w:left w:val="single" w:color="BFBFBF" w:sz="4"/>
@@ -2161,7 +2803,39 @@
         </w:tc>
         <w:tc>
           <w:tcPr>
-            <w:tcW w:type="dxa" w:w="10878"/>
+            <w:tcW w:type="dxa" w:w="2100"/>
+            <w:tcBorders>
+              <w:top w:val="single" w:color="BFBFBF" w:sz="4"/>
+              <w:left w:val="single" w:color="BFBFBF" w:sz="4"/>
+              <w:bottom w:val="single" w:color="BFBFBF" w:sz="4"/>
+              <w:right w:val="single" w:color="BFBFBF" w:sz="4"/>
+            </w:tcBorders>
+            <w:tcMar>
+              <w:top w:type="dxa" w:w="60"/>
+              <w:left w:type="dxa" w:w="90"/>
+              <w:bottom w:type="dxa" w:w="60"/>
+              <w:right w:type="dxa" w:w="90"/>
+            </w:tcMar>
+          </w:tcPr>
+          <w:p>
+            <w:pPr>
+              <w:spacing w:after="20"/>
+            </w:pPr>
+            <w:r>
+              <w:rPr>
+                <w:rFonts w:ascii="Arial" w:cs="Arial" w:eastAsia="Arial" w:hAnsi="Arial"/>
+                <w:b w:val="false"/>
+                <w:bCs w:val="false"/>
+                <w:sz w:val="18"/>
+                <w:szCs w:val="18"/>
+              </w:rPr>
+              <w:t xml:space="preserve">Tất cả</w:t>
+            </w:r>
+          </w:p>
+        </w:tc>
+        <w:tc>
+          <w:tcPr>
+            <w:tcW w:type="dxa" w:w="8678"/>
             <w:tcBorders>
               <w:top w:val="single" w:color="BFBFBF" w:sz="4"/>
               <w:left w:val="single" w:color="BFBFBF" w:sz="4"/>
@@ -2193,7 +2867,7 @@
         </w:tc>
         <w:tc>
           <w:tcPr>
-            <w:tcW w:type="dxa" w:w="1400"/>
+            <w:tcW w:type="dxa" w:w="2000"/>
             <w:tcBorders>
               <w:top w:val="single" w:color="BFBFBF" w:sz="4"/>
               <w:left w:val="single" w:color="BFBFBF" w:sz="4"/>
@@ -2238,9 +2912,873 @@
         <w:rPr>
           <w:rFonts w:ascii="Arial" w:cs="Arial" w:eastAsia="Arial" w:hAnsi="Arial"/>
         </w:rPr>
-        <w:t xml:space="preserve">Thứ tự phụ thuộc đã kiểm: khuyến mãi áp vào POS sau khi POS xong (S2 sang S3); trừ kho sau khi có công thức (S3 sang S4); BC-05 sau khi có dữ liệu nhập kho (S3).</w:t>
+        <w:t xml:space="preserve">Thứ tự phụ thuộc đã kiểm: khuyến mãi áp vào order sau khi order xong (S2 sang S3); trừ kho sau khi có công thức (S3 sang S4); BC-05 sau khi có dữ liệu nhập kho (S3).</w:t>
       </w:r>
     </w:p>
+    <w:p>
+      <w:pPr>
+        <w:spacing w:after="120"/>
+      </w:pPr>
+    </w:p>
+    <w:p>
+      <w:pPr>
+        <w:spacing w:after="100"/>
+      </w:pPr>
+      <w:r>
+        <w:rPr>
+          <w:rFonts w:ascii="Arial" w:cs="Arial" w:eastAsia="Arial" w:hAnsi="Arial"/>
+        </w:rPr>
+        <w:t xml:space="preserve">Sprint hoàn thành từng chức năng chính:</w:t>
+      </w:r>
+    </w:p>
+    <w:tbl>
+      <w:tblPr>
+        <w:tblW w:type="dxa" w:w="14678"/>
+        <w:tblBorders>
+          <w:top w:val="single" w:color="auto" w:sz="4"/>
+          <w:left w:val="single" w:color="auto" w:sz="4"/>
+          <w:bottom w:val="single" w:color="auto" w:sz="4"/>
+          <w:right w:val="single" w:color="auto" w:sz="4"/>
+          <w:insideH w:val="single" w:color="auto" w:sz="4"/>
+          <w:insideV w:val="single" w:color="auto" w:sz="4"/>
+        </w:tblBorders>
+      </w:tblPr>
+      <w:tblGrid>
+        <w:gridCol w:w="8000"/>
+        <w:gridCol w:w="6678"/>
+      </w:tblGrid>
+      <w:tr>
+        <w:trPr>
+          <w:cantSplit/>
+          <w:tblHeader/>
+        </w:trPr>
+        <w:tc>
+          <w:tcPr>
+            <w:tcW w:type="dxa" w:w="8000"/>
+            <w:tcBorders>
+              <w:top w:val="single" w:color="BFBFBF" w:sz="4"/>
+              <w:left w:val="single" w:color="BFBFBF" w:sz="4"/>
+              <w:bottom w:val="single" w:color="BFBFBF" w:sz="4"/>
+              <w:right w:val="single" w:color="BFBFBF" w:sz="4"/>
+            </w:tcBorders>
+            <w:shd w:fill="D9E2F3" w:color="auto" w:val="clear"/>
+            <w:tcMar>
+              <w:top w:type="dxa" w:w="60"/>
+              <w:left w:type="dxa" w:w="90"/>
+              <w:bottom w:type="dxa" w:w="60"/>
+              <w:right w:type="dxa" w:w="90"/>
+            </w:tcMar>
+          </w:tcPr>
+          <w:p>
+            <w:pPr>
+              <w:spacing w:after="20"/>
+            </w:pPr>
+            <w:r>
+              <w:rPr>
+                <w:rFonts w:ascii="Arial" w:cs="Arial" w:eastAsia="Arial" w:hAnsi="Arial"/>
+                <w:b/>
+                <w:bCs/>
+                <w:sz w:val="18"/>
+                <w:szCs w:val="18"/>
+              </w:rPr>
+              <w:t xml:space="preserve">Chức năng chính</w:t>
+            </w:r>
+          </w:p>
+        </w:tc>
+        <w:tc>
+          <w:tcPr>
+            <w:tcW w:type="dxa" w:w="6678"/>
+            <w:tcBorders>
+              <w:top w:val="single" w:color="BFBFBF" w:sz="4"/>
+              <w:left w:val="single" w:color="BFBFBF" w:sz="4"/>
+              <w:bottom w:val="single" w:color="BFBFBF" w:sz="4"/>
+              <w:right w:val="single" w:color="BFBFBF" w:sz="4"/>
+            </w:tcBorders>
+            <w:shd w:fill="D9E2F3" w:color="auto" w:val="clear"/>
+            <w:tcMar>
+              <w:top w:type="dxa" w:w="60"/>
+              <w:left w:type="dxa" w:w="90"/>
+              <w:bottom w:type="dxa" w:w="60"/>
+              <w:right w:type="dxa" w:w="90"/>
+            </w:tcMar>
+          </w:tcPr>
+          <w:p>
+            <w:pPr>
+              <w:spacing w:after="20"/>
+            </w:pPr>
+            <w:r>
+              <w:rPr>
+                <w:rFonts w:ascii="Arial" w:cs="Arial" w:eastAsia="Arial" w:hAnsi="Arial"/>
+                <w:b/>
+                <w:bCs/>
+                <w:sz w:val="18"/>
+                <w:szCs w:val="18"/>
+              </w:rPr>
+              <w:t xml:space="preserve">Sprint</w:t>
+            </w:r>
+          </w:p>
+        </w:tc>
+      </w:tr>
+      <w:tr>
+        <w:trPr>
+          <w:cantSplit/>
+        </w:trPr>
+        <w:tc>
+          <w:tcPr>
+            <w:tcW w:type="dxa" w:w="8000"/>
+            <w:tcBorders>
+              <w:top w:val="single" w:color="BFBFBF" w:sz="4"/>
+              <w:left w:val="single" w:color="BFBFBF" w:sz="4"/>
+              <w:bottom w:val="single" w:color="BFBFBF" w:sz="4"/>
+              <w:right w:val="single" w:color="BFBFBF" w:sz="4"/>
+            </w:tcBorders>
+            <w:tcMar>
+              <w:top w:type="dxa" w:w="60"/>
+              <w:left w:type="dxa" w:w="90"/>
+              <w:bottom w:type="dxa" w:w="60"/>
+              <w:right w:type="dxa" w:w="90"/>
+            </w:tcMar>
+          </w:tcPr>
+          <w:p>
+            <w:pPr>
+              <w:spacing w:after="20"/>
+            </w:pPr>
+            <w:r>
+              <w:rPr>
+                <w:rFonts w:ascii="Arial" w:cs="Arial" w:eastAsia="Arial" w:hAnsi="Arial"/>
+                <w:b w:val="false"/>
+                <w:bCs w:val="false"/>
+                <w:sz w:val="18"/>
+                <w:szCs w:val="18"/>
+              </w:rPr>
+              <w:t xml:space="preserve">CN-01 Quản lý tài khoản</w:t>
+            </w:r>
+          </w:p>
+        </w:tc>
+        <w:tc>
+          <w:tcPr>
+            <w:tcW w:type="dxa" w:w="6678"/>
+            <w:tcBorders>
+              <w:top w:val="single" w:color="BFBFBF" w:sz="4"/>
+              <w:left w:val="single" w:color="BFBFBF" w:sz="4"/>
+              <w:bottom w:val="single" w:color="BFBFBF" w:sz="4"/>
+              <w:right w:val="single" w:color="BFBFBF" w:sz="4"/>
+            </w:tcBorders>
+            <w:tcMar>
+              <w:top w:type="dxa" w:w="60"/>
+              <w:left w:type="dxa" w:w="90"/>
+              <w:bottom w:type="dxa" w:w="60"/>
+              <w:right w:type="dxa" w:w="90"/>
+            </w:tcMar>
+          </w:tcPr>
+          <w:p>
+            <w:pPr>
+              <w:spacing w:after="20"/>
+            </w:pPr>
+            <w:r>
+              <w:rPr>
+                <w:rFonts w:ascii="Arial" w:cs="Arial" w:eastAsia="Arial" w:hAnsi="Arial"/>
+                <w:b w:val="false"/>
+                <w:bCs w:val="false"/>
+                <w:sz w:val="18"/>
+                <w:szCs w:val="18"/>
+              </w:rPr>
+              <w:t xml:space="preserve">S1 (đăng nhập), S4 (đổi mật khẩu)</w:t>
+            </w:r>
+          </w:p>
+        </w:tc>
+      </w:tr>
+      <w:tr>
+        <w:trPr>
+          <w:cantSplit/>
+        </w:trPr>
+        <w:tc>
+          <w:tcPr>
+            <w:tcW w:type="dxa" w:w="8000"/>
+            <w:tcBorders>
+              <w:top w:val="single" w:color="BFBFBF" w:sz="4"/>
+              <w:left w:val="single" w:color="BFBFBF" w:sz="4"/>
+              <w:bottom w:val="single" w:color="BFBFBF" w:sz="4"/>
+              <w:right w:val="single" w:color="BFBFBF" w:sz="4"/>
+            </w:tcBorders>
+            <w:tcMar>
+              <w:top w:type="dxa" w:w="60"/>
+              <w:left w:type="dxa" w:w="90"/>
+              <w:bottom w:type="dxa" w:w="60"/>
+              <w:right w:type="dxa" w:w="90"/>
+            </w:tcMar>
+          </w:tcPr>
+          <w:p>
+            <w:pPr>
+              <w:spacing w:after="20"/>
+            </w:pPr>
+            <w:r>
+              <w:rPr>
+                <w:rFonts w:ascii="Arial" w:cs="Arial" w:eastAsia="Arial" w:hAnsi="Arial"/>
+                <w:b w:val="false"/>
+                <w:bCs w:val="false"/>
+                <w:sz w:val="18"/>
+                <w:szCs w:val="18"/>
+              </w:rPr>
+              <w:t xml:space="preserve">CN-02 Quản lý sản phẩm và loại sản phẩm</w:t>
+            </w:r>
+          </w:p>
+        </w:tc>
+        <w:tc>
+          <w:tcPr>
+            <w:tcW w:type="dxa" w:w="6678"/>
+            <w:tcBorders>
+              <w:top w:val="single" w:color="BFBFBF" w:sz="4"/>
+              <w:left w:val="single" w:color="BFBFBF" w:sz="4"/>
+              <w:bottom w:val="single" w:color="BFBFBF" w:sz="4"/>
+              <w:right w:val="single" w:color="BFBFBF" w:sz="4"/>
+            </w:tcBorders>
+            <w:tcMar>
+              <w:top w:type="dxa" w:w="60"/>
+              <w:left w:type="dxa" w:w="90"/>
+              <w:bottom w:type="dxa" w:w="60"/>
+              <w:right w:type="dxa" w:w="90"/>
+            </w:tcMar>
+          </w:tcPr>
+          <w:p>
+            <w:pPr>
+              <w:spacing w:after="20"/>
+            </w:pPr>
+            <w:r>
+              <w:rPr>
+                <w:rFonts w:ascii="Arial" w:cs="Arial" w:eastAsia="Arial" w:hAnsi="Arial"/>
+                <w:b w:val="false"/>
+                <w:bCs w:val="false"/>
+                <w:sz w:val="18"/>
+                <w:szCs w:val="18"/>
+              </w:rPr>
+              <w:t xml:space="preserve">S1</w:t>
+            </w:r>
+          </w:p>
+        </w:tc>
+      </w:tr>
+      <w:tr>
+        <w:trPr>
+          <w:cantSplit/>
+        </w:trPr>
+        <w:tc>
+          <w:tcPr>
+            <w:tcW w:type="dxa" w:w="8000"/>
+            <w:tcBorders>
+              <w:top w:val="single" w:color="BFBFBF" w:sz="4"/>
+              <w:left w:val="single" w:color="BFBFBF" w:sz="4"/>
+              <w:bottom w:val="single" w:color="BFBFBF" w:sz="4"/>
+              <w:right w:val="single" w:color="BFBFBF" w:sz="4"/>
+            </w:tcBorders>
+            <w:tcMar>
+              <w:top w:type="dxa" w:w="60"/>
+              <w:left w:type="dxa" w:w="90"/>
+              <w:bottom w:type="dxa" w:w="60"/>
+              <w:right w:type="dxa" w:w="90"/>
+            </w:tcMar>
+          </w:tcPr>
+          <w:p>
+            <w:pPr>
+              <w:spacing w:after="20"/>
+            </w:pPr>
+            <w:r>
+              <w:rPr>
+                <w:rFonts w:ascii="Arial" w:cs="Arial" w:eastAsia="Arial" w:hAnsi="Arial"/>
+                <w:b w:val="false"/>
+                <w:bCs w:val="false"/>
+                <w:sz w:val="18"/>
+                <w:szCs w:val="18"/>
+              </w:rPr>
+              <w:t xml:space="preserve">CN-03 Quản lý hóa đơn</w:t>
+            </w:r>
+          </w:p>
+        </w:tc>
+        <w:tc>
+          <w:tcPr>
+            <w:tcW w:type="dxa" w:w="6678"/>
+            <w:tcBorders>
+              <w:top w:val="single" w:color="BFBFBF" w:sz="4"/>
+              <w:left w:val="single" w:color="BFBFBF" w:sz="4"/>
+              <w:bottom w:val="single" w:color="BFBFBF" w:sz="4"/>
+              <w:right w:val="single" w:color="BFBFBF" w:sz="4"/>
+            </w:tcBorders>
+            <w:tcMar>
+              <w:top w:type="dxa" w:w="60"/>
+              <w:left w:type="dxa" w:w="90"/>
+              <w:bottom w:type="dxa" w:w="60"/>
+              <w:right w:type="dxa" w:w="90"/>
+            </w:tcMar>
+          </w:tcPr>
+          <w:p>
+            <w:pPr>
+              <w:spacing w:after="20"/>
+            </w:pPr>
+            <w:r>
+              <w:rPr>
+                <w:rFonts w:ascii="Arial" w:cs="Arial" w:eastAsia="Arial" w:hAnsi="Arial"/>
+                <w:b w:val="false"/>
+                <w:bCs w:val="false"/>
+                <w:sz w:val="18"/>
+                <w:szCs w:val="18"/>
+              </w:rPr>
+              <w:t xml:space="preserve">S1 (danh sách), S2 (thanh toán, xem và in)</w:t>
+            </w:r>
+          </w:p>
+        </w:tc>
+      </w:tr>
+      <w:tr>
+        <w:trPr>
+          <w:cantSplit/>
+        </w:trPr>
+        <w:tc>
+          <w:tcPr>
+            <w:tcW w:type="dxa" w:w="8000"/>
+            <w:tcBorders>
+              <w:top w:val="single" w:color="BFBFBF" w:sz="4"/>
+              <w:left w:val="single" w:color="BFBFBF" w:sz="4"/>
+              <w:bottom w:val="single" w:color="BFBFBF" w:sz="4"/>
+              <w:right w:val="single" w:color="BFBFBF" w:sz="4"/>
+            </w:tcBorders>
+            <w:tcMar>
+              <w:top w:type="dxa" w:w="60"/>
+              <w:left w:type="dxa" w:w="90"/>
+              <w:bottom w:type="dxa" w:w="60"/>
+              <w:right w:type="dxa" w:w="90"/>
+            </w:tcMar>
+          </w:tcPr>
+          <w:p>
+            <w:pPr>
+              <w:spacing w:after="20"/>
+            </w:pPr>
+            <w:r>
+              <w:rPr>
+                <w:rFonts w:ascii="Arial" w:cs="Arial" w:eastAsia="Arial" w:hAnsi="Arial"/>
+                <w:b w:val="false"/>
+                <w:bCs w:val="false"/>
+                <w:sz w:val="18"/>
+                <w:szCs w:val="18"/>
+              </w:rPr>
+              <w:t xml:space="preserve">CN-04 Quản lý khuyến mãi</w:t>
+            </w:r>
+          </w:p>
+        </w:tc>
+        <w:tc>
+          <w:tcPr>
+            <w:tcW w:type="dxa" w:w="6678"/>
+            <w:tcBorders>
+              <w:top w:val="single" w:color="BFBFBF" w:sz="4"/>
+              <w:left w:val="single" w:color="BFBFBF" w:sz="4"/>
+              <w:bottom w:val="single" w:color="BFBFBF" w:sz="4"/>
+              <w:right w:val="single" w:color="BFBFBF" w:sz="4"/>
+            </w:tcBorders>
+            <w:tcMar>
+              <w:top w:type="dxa" w:w="60"/>
+              <w:left w:type="dxa" w:w="90"/>
+              <w:bottom w:type="dxa" w:w="60"/>
+              <w:right w:type="dxa" w:w="90"/>
+            </w:tcMar>
+          </w:tcPr>
+          <w:p>
+            <w:pPr>
+              <w:spacing w:after="20"/>
+            </w:pPr>
+            <w:r>
+              <w:rPr>
+                <w:rFonts w:ascii="Arial" w:cs="Arial" w:eastAsia="Arial" w:hAnsi="Arial"/>
+                <w:b w:val="false"/>
+                <w:bCs w:val="false"/>
+                <w:sz w:val="18"/>
+                <w:szCs w:val="18"/>
+              </w:rPr>
+              <w:t xml:space="preserve">S3</w:t>
+            </w:r>
+          </w:p>
+        </w:tc>
+      </w:tr>
+      <w:tr>
+        <w:trPr>
+          <w:cantSplit/>
+        </w:trPr>
+        <w:tc>
+          <w:tcPr>
+            <w:tcW w:type="dxa" w:w="8000"/>
+            <w:tcBorders>
+              <w:top w:val="single" w:color="BFBFBF" w:sz="4"/>
+              <w:left w:val="single" w:color="BFBFBF" w:sz="4"/>
+              <w:bottom w:val="single" w:color="BFBFBF" w:sz="4"/>
+              <w:right w:val="single" w:color="BFBFBF" w:sz="4"/>
+            </w:tcBorders>
+            <w:tcMar>
+              <w:top w:type="dxa" w:w="60"/>
+              <w:left w:type="dxa" w:w="90"/>
+              <w:bottom w:type="dxa" w:w="60"/>
+              <w:right w:type="dxa" w:w="90"/>
+            </w:tcMar>
+          </w:tcPr>
+          <w:p>
+            <w:pPr>
+              <w:spacing w:after="20"/>
+            </w:pPr>
+            <w:r>
+              <w:rPr>
+                <w:rFonts w:ascii="Arial" w:cs="Arial" w:eastAsia="Arial" w:hAnsi="Arial"/>
+                <w:b w:val="false"/>
+                <w:bCs w:val="false"/>
+                <w:sz w:val="18"/>
+                <w:szCs w:val="18"/>
+              </w:rPr>
+              <w:t xml:space="preserve">CN-05 Quản lý khách hàng</w:t>
+            </w:r>
+          </w:p>
+        </w:tc>
+        <w:tc>
+          <w:tcPr>
+            <w:tcW w:type="dxa" w:w="6678"/>
+            <w:tcBorders>
+              <w:top w:val="single" w:color="BFBFBF" w:sz="4"/>
+              <w:left w:val="single" w:color="BFBFBF" w:sz="4"/>
+              <w:bottom w:val="single" w:color="BFBFBF" w:sz="4"/>
+              <w:right w:val="single" w:color="BFBFBF" w:sz="4"/>
+            </w:tcBorders>
+            <w:tcMar>
+              <w:top w:type="dxa" w:w="60"/>
+              <w:left w:type="dxa" w:w="90"/>
+              <w:bottom w:type="dxa" w:w="60"/>
+              <w:right w:type="dxa" w:w="90"/>
+            </w:tcMar>
+          </w:tcPr>
+          <w:p>
+            <w:pPr>
+              <w:spacing w:after="20"/>
+            </w:pPr>
+            <w:r>
+              <w:rPr>
+                <w:rFonts w:ascii="Arial" w:cs="Arial" w:eastAsia="Arial" w:hAnsi="Arial"/>
+                <w:b w:val="false"/>
+                <w:bCs w:val="false"/>
+                <w:sz w:val="18"/>
+                <w:szCs w:val="18"/>
+              </w:rPr>
+              <w:t xml:space="preserve">S2 (KH-01 đến KH-04, gắn khách), S4 (top khách)</w:t>
+            </w:r>
+          </w:p>
+        </w:tc>
+      </w:tr>
+      <w:tr>
+        <w:trPr>
+          <w:cantSplit/>
+        </w:trPr>
+        <w:tc>
+          <w:tcPr>
+            <w:tcW w:type="dxa" w:w="8000"/>
+            <w:tcBorders>
+              <w:top w:val="single" w:color="BFBFBF" w:sz="4"/>
+              <w:left w:val="single" w:color="BFBFBF" w:sz="4"/>
+              <w:bottom w:val="single" w:color="BFBFBF" w:sz="4"/>
+              <w:right w:val="single" w:color="BFBFBF" w:sz="4"/>
+            </w:tcBorders>
+            <w:tcMar>
+              <w:top w:type="dxa" w:w="60"/>
+              <w:left w:type="dxa" w:w="90"/>
+              <w:bottom w:type="dxa" w:w="60"/>
+              <w:right w:type="dxa" w:w="90"/>
+            </w:tcMar>
+          </w:tcPr>
+          <w:p>
+            <w:pPr>
+              <w:spacing w:after="20"/>
+            </w:pPr>
+            <w:r>
+              <w:rPr>
+                <w:rFonts w:ascii="Arial" w:cs="Arial" w:eastAsia="Arial" w:hAnsi="Arial"/>
+                <w:b w:val="false"/>
+                <w:bCs w:val="false"/>
+                <w:sz w:val="18"/>
+                <w:szCs w:val="18"/>
+              </w:rPr>
+              <w:t xml:space="preserve">CN-06 Quản lý nhập hàng</w:t>
+            </w:r>
+          </w:p>
+        </w:tc>
+        <w:tc>
+          <w:tcPr>
+            <w:tcW w:type="dxa" w:w="6678"/>
+            <w:tcBorders>
+              <w:top w:val="single" w:color="BFBFBF" w:sz="4"/>
+              <w:left w:val="single" w:color="BFBFBF" w:sz="4"/>
+              <w:bottom w:val="single" w:color="BFBFBF" w:sz="4"/>
+              <w:right w:val="single" w:color="BFBFBF" w:sz="4"/>
+            </w:tcBorders>
+            <w:tcMar>
+              <w:top w:type="dxa" w:w="60"/>
+              <w:left w:type="dxa" w:w="90"/>
+              <w:bottom w:type="dxa" w:w="60"/>
+              <w:right w:type="dxa" w:w="90"/>
+            </w:tcMar>
+          </w:tcPr>
+          <w:p>
+            <w:pPr>
+              <w:spacing w:after="20"/>
+            </w:pPr>
+            <w:r>
+              <w:rPr>
+                <w:rFonts w:ascii="Arial" w:cs="Arial" w:eastAsia="Arial" w:hAnsi="Arial"/>
+                <w:b w:val="false"/>
+                <w:bCs w:val="false"/>
+                <w:sz w:val="18"/>
+                <w:szCs w:val="18"/>
+              </w:rPr>
+              <w:t xml:space="preserve">S3</w:t>
+            </w:r>
+          </w:p>
+        </w:tc>
+      </w:tr>
+      <w:tr>
+        <w:trPr>
+          <w:cantSplit/>
+        </w:trPr>
+        <w:tc>
+          <w:tcPr>
+            <w:tcW w:type="dxa" w:w="8000"/>
+            <w:tcBorders>
+              <w:top w:val="single" w:color="BFBFBF" w:sz="4"/>
+              <w:left w:val="single" w:color="BFBFBF" w:sz="4"/>
+              <w:bottom w:val="single" w:color="BFBFBF" w:sz="4"/>
+              <w:right w:val="single" w:color="BFBFBF" w:sz="4"/>
+            </w:tcBorders>
+            <w:tcMar>
+              <w:top w:type="dxa" w:w="60"/>
+              <w:left w:type="dxa" w:w="90"/>
+              <w:bottom w:type="dxa" w:w="60"/>
+              <w:right w:type="dxa" w:w="90"/>
+            </w:tcMar>
+          </w:tcPr>
+          <w:p>
+            <w:pPr>
+              <w:spacing w:after="20"/>
+            </w:pPr>
+            <w:r>
+              <w:rPr>
+                <w:rFonts w:ascii="Arial" w:cs="Arial" w:eastAsia="Arial" w:hAnsi="Arial"/>
+                <w:b w:val="false"/>
+                <w:bCs w:val="false"/>
+                <w:sz w:val="18"/>
+                <w:szCs w:val="18"/>
+              </w:rPr>
+              <w:t xml:space="preserve">CN-07 Quản lý nhân viên</w:t>
+            </w:r>
+          </w:p>
+        </w:tc>
+        <w:tc>
+          <w:tcPr>
+            <w:tcW w:type="dxa" w:w="6678"/>
+            <w:tcBorders>
+              <w:top w:val="single" w:color="BFBFBF" w:sz="4"/>
+              <w:left w:val="single" w:color="BFBFBF" w:sz="4"/>
+              <w:bottom w:val="single" w:color="BFBFBF" w:sz="4"/>
+              <w:right w:val="single" w:color="BFBFBF" w:sz="4"/>
+            </w:tcBorders>
+            <w:tcMar>
+              <w:top w:type="dxa" w:w="60"/>
+              <w:left w:type="dxa" w:w="90"/>
+              <w:bottom w:type="dxa" w:w="60"/>
+              <w:right w:type="dxa" w:w="90"/>
+            </w:tcMar>
+          </w:tcPr>
+          <w:p>
+            <w:pPr>
+              <w:spacing w:after="20"/>
+            </w:pPr>
+            <w:r>
+              <w:rPr>
+                <w:rFonts w:ascii="Arial" w:cs="Arial" w:eastAsia="Arial" w:hAnsi="Arial"/>
+                <w:b w:val="false"/>
+                <w:bCs w:val="false"/>
+                <w:sz w:val="18"/>
+                <w:szCs w:val="18"/>
+              </w:rPr>
+              <w:t xml:space="preserve">S4</w:t>
+            </w:r>
+          </w:p>
+        </w:tc>
+      </w:tr>
+      <w:tr>
+        <w:trPr>
+          <w:cantSplit/>
+        </w:trPr>
+        <w:tc>
+          <w:tcPr>
+            <w:tcW w:type="dxa" w:w="8000"/>
+            <w:tcBorders>
+              <w:top w:val="single" w:color="BFBFBF" w:sz="4"/>
+              <w:left w:val="single" w:color="BFBFBF" w:sz="4"/>
+              <w:bottom w:val="single" w:color="BFBFBF" w:sz="4"/>
+              <w:right w:val="single" w:color="BFBFBF" w:sz="4"/>
+            </w:tcBorders>
+            <w:tcMar>
+              <w:top w:type="dxa" w:w="60"/>
+              <w:left w:type="dxa" w:w="90"/>
+              <w:bottom w:type="dxa" w:w="60"/>
+              <w:right w:type="dxa" w:w="90"/>
+            </w:tcMar>
+          </w:tcPr>
+          <w:p>
+            <w:pPr>
+              <w:spacing w:after="20"/>
+            </w:pPr>
+            <w:r>
+              <w:rPr>
+                <w:rFonts w:ascii="Arial" w:cs="Arial" w:eastAsia="Arial" w:hAnsi="Arial"/>
+                <w:b w:val="false"/>
+                <w:bCs w:val="false"/>
+                <w:sz w:val="18"/>
+                <w:szCs w:val="18"/>
+              </w:rPr>
+              <w:t xml:space="preserve">CN-08 Quản lý nhà cung cấp</w:t>
+            </w:r>
+          </w:p>
+        </w:tc>
+        <w:tc>
+          <w:tcPr>
+            <w:tcW w:type="dxa" w:w="6678"/>
+            <w:tcBorders>
+              <w:top w:val="single" w:color="BFBFBF" w:sz="4"/>
+              <w:left w:val="single" w:color="BFBFBF" w:sz="4"/>
+              <w:bottom w:val="single" w:color="BFBFBF" w:sz="4"/>
+              <w:right w:val="single" w:color="BFBFBF" w:sz="4"/>
+            </w:tcBorders>
+            <w:tcMar>
+              <w:top w:type="dxa" w:w="60"/>
+              <w:left w:type="dxa" w:w="90"/>
+              <w:bottom w:type="dxa" w:w="60"/>
+              <w:right w:type="dxa" w:w="90"/>
+            </w:tcMar>
+          </w:tcPr>
+          <w:p>
+            <w:pPr>
+              <w:spacing w:after="20"/>
+            </w:pPr>
+            <w:r>
+              <w:rPr>
+                <w:rFonts w:ascii="Arial" w:cs="Arial" w:eastAsia="Arial" w:hAnsi="Arial"/>
+                <w:b w:val="false"/>
+                <w:bCs w:val="false"/>
+                <w:sz w:val="18"/>
+                <w:szCs w:val="18"/>
+              </w:rPr>
+              <w:t xml:space="preserve">S3</w:t>
+            </w:r>
+          </w:p>
+        </w:tc>
+      </w:tr>
+      <w:tr>
+        <w:trPr>
+          <w:cantSplit/>
+        </w:trPr>
+        <w:tc>
+          <w:tcPr>
+            <w:tcW w:type="dxa" w:w="8000"/>
+            <w:tcBorders>
+              <w:top w:val="single" w:color="BFBFBF" w:sz="4"/>
+              <w:left w:val="single" w:color="BFBFBF" w:sz="4"/>
+              <w:bottom w:val="single" w:color="BFBFBF" w:sz="4"/>
+              <w:right w:val="single" w:color="BFBFBF" w:sz="4"/>
+            </w:tcBorders>
+            <w:tcMar>
+              <w:top w:type="dxa" w:w="60"/>
+              <w:left w:type="dxa" w:w="90"/>
+              <w:bottom w:type="dxa" w:w="60"/>
+              <w:right w:type="dxa" w:w="90"/>
+            </w:tcMar>
+          </w:tcPr>
+          <w:p>
+            <w:pPr>
+              <w:spacing w:after="20"/>
+            </w:pPr>
+            <w:r>
+              <w:rPr>
+                <w:rFonts w:ascii="Arial" w:cs="Arial" w:eastAsia="Arial" w:hAnsi="Arial"/>
+                <w:b w:val="false"/>
+                <w:bCs w:val="false"/>
+                <w:sz w:val="18"/>
+                <w:szCs w:val="18"/>
+              </w:rPr>
+              <w:t xml:space="preserve">CN-09 Quản lý đơn đặt hàng</w:t>
+            </w:r>
+          </w:p>
+        </w:tc>
+        <w:tc>
+          <w:tcPr>
+            <w:tcW w:type="dxa" w:w="6678"/>
+            <w:tcBorders>
+              <w:top w:val="single" w:color="BFBFBF" w:sz="4"/>
+              <w:left w:val="single" w:color="BFBFBF" w:sz="4"/>
+              <w:bottom w:val="single" w:color="BFBFBF" w:sz="4"/>
+              <w:right w:val="single" w:color="BFBFBF" w:sz="4"/>
+            </w:tcBorders>
+            <w:tcMar>
+              <w:top w:type="dxa" w:w="60"/>
+              <w:left w:type="dxa" w:w="90"/>
+              <w:bottom w:type="dxa" w:w="60"/>
+              <w:right w:type="dxa" w:w="90"/>
+            </w:tcMar>
+          </w:tcPr>
+          <w:p>
+            <w:pPr>
+              <w:spacing w:after="20"/>
+            </w:pPr>
+            <w:r>
+              <w:rPr>
+                <w:rFonts w:ascii="Arial" w:cs="Arial" w:eastAsia="Arial" w:hAnsi="Arial"/>
+                <w:b w:val="false"/>
+                <w:bCs w:val="false"/>
+                <w:sz w:val="18"/>
+                <w:szCs w:val="18"/>
+              </w:rPr>
+              <w:t xml:space="preserve">S1 đến S2, S4 (trừ và trả kho)</w:t>
+            </w:r>
+          </w:p>
+        </w:tc>
+      </w:tr>
+      <w:tr>
+        <w:trPr>
+          <w:cantSplit/>
+        </w:trPr>
+        <w:tc>
+          <w:tcPr>
+            <w:tcW w:type="dxa" w:w="8000"/>
+            <w:tcBorders>
+              <w:top w:val="single" w:color="BFBFBF" w:sz="4"/>
+              <w:left w:val="single" w:color="BFBFBF" w:sz="4"/>
+              <w:bottom w:val="single" w:color="BFBFBF" w:sz="4"/>
+              <w:right w:val="single" w:color="BFBFBF" w:sz="4"/>
+            </w:tcBorders>
+            <w:tcMar>
+              <w:top w:type="dxa" w:w="60"/>
+              <w:left w:type="dxa" w:w="90"/>
+              <w:bottom w:type="dxa" w:w="60"/>
+              <w:right w:type="dxa" w:w="90"/>
+            </w:tcMar>
+          </w:tcPr>
+          <w:p>
+            <w:pPr>
+              <w:spacing w:after="20"/>
+            </w:pPr>
+            <w:r>
+              <w:rPr>
+                <w:rFonts w:ascii="Arial" w:cs="Arial" w:eastAsia="Arial" w:hAnsi="Arial"/>
+                <w:b w:val="false"/>
+                <w:bCs w:val="false"/>
+                <w:sz w:val="18"/>
+                <w:szCs w:val="18"/>
+              </w:rPr>
+              <w:t xml:space="preserve">CN-10 Quản lý nguyên liệu và công thức món</w:t>
+            </w:r>
+          </w:p>
+        </w:tc>
+        <w:tc>
+          <w:tcPr>
+            <w:tcW w:type="dxa" w:w="6678"/>
+            <w:tcBorders>
+              <w:top w:val="single" w:color="BFBFBF" w:sz="4"/>
+              <w:left w:val="single" w:color="BFBFBF" w:sz="4"/>
+              <w:bottom w:val="single" w:color="BFBFBF" w:sz="4"/>
+              <w:right w:val="single" w:color="BFBFBF" w:sz="4"/>
+            </w:tcBorders>
+            <w:tcMar>
+              <w:top w:type="dxa" w:w="60"/>
+              <w:left w:type="dxa" w:w="90"/>
+              <w:bottom w:type="dxa" w:w="60"/>
+              <w:right w:type="dxa" w:w="90"/>
+            </w:tcMar>
+          </w:tcPr>
+          <w:p>
+            <w:pPr>
+              <w:spacing w:after="20"/>
+            </w:pPr>
+            <w:r>
+              <w:rPr>
+                <w:rFonts w:ascii="Arial" w:cs="Arial" w:eastAsia="Arial" w:hAnsi="Arial"/>
+                <w:b w:val="false"/>
+                <w:bCs w:val="false"/>
+                <w:sz w:val="18"/>
+                <w:szCs w:val="18"/>
+              </w:rPr>
+              <w:t xml:space="preserve">S3 (nguyên liệu, công thức), S4 (tồn kho)</w:t>
+            </w:r>
+          </w:p>
+        </w:tc>
+      </w:tr>
+      <w:tr>
+        <w:trPr>
+          <w:cantSplit/>
+        </w:trPr>
+        <w:tc>
+          <w:tcPr>
+            <w:tcW w:type="dxa" w:w="8000"/>
+            <w:tcBorders>
+              <w:top w:val="single" w:color="BFBFBF" w:sz="4"/>
+              <w:left w:val="single" w:color="BFBFBF" w:sz="4"/>
+              <w:bottom w:val="single" w:color="BFBFBF" w:sz="4"/>
+              <w:right w:val="single" w:color="BFBFBF" w:sz="4"/>
+            </w:tcBorders>
+            <w:tcMar>
+              <w:top w:type="dxa" w:w="60"/>
+              <w:left w:type="dxa" w:w="90"/>
+              <w:bottom w:type="dxa" w:w="60"/>
+              <w:right w:type="dxa" w:w="90"/>
+            </w:tcMar>
+          </w:tcPr>
+          <w:p>
+            <w:pPr>
+              <w:spacing w:after="20"/>
+            </w:pPr>
+            <w:r>
+              <w:rPr>
+                <w:rFonts w:ascii="Arial" w:cs="Arial" w:eastAsia="Arial" w:hAnsi="Arial"/>
+                <w:b w:val="false"/>
+                <w:bCs w:val="false"/>
+                <w:sz w:val="18"/>
+                <w:szCs w:val="18"/>
+              </w:rPr>
+              <w:t xml:space="preserve">CN-11 Báo cáo thống kê</w:t>
+            </w:r>
+          </w:p>
+        </w:tc>
+        <w:tc>
+          <w:tcPr>
+            <w:tcW w:type="dxa" w:w="6678"/>
+            <w:tcBorders>
+              <w:top w:val="single" w:color="BFBFBF" w:sz="4"/>
+              <w:left w:val="single" w:color="BFBFBF" w:sz="4"/>
+              <w:bottom w:val="single" w:color="BFBFBF" w:sz="4"/>
+              <w:right w:val="single" w:color="BFBFBF" w:sz="4"/>
+            </w:tcBorders>
+            <w:tcMar>
+              <w:top w:type="dxa" w:w="60"/>
+              <w:left w:type="dxa" w:w="90"/>
+              <w:bottom w:type="dxa" w:w="60"/>
+              <w:right w:type="dxa" w:w="90"/>
+            </w:tcMar>
+          </w:tcPr>
+          <w:p>
+            <w:pPr>
+              <w:spacing w:after="20"/>
+            </w:pPr>
+            <w:r>
+              <w:rPr>
+                <w:rFonts w:ascii="Arial" w:cs="Arial" w:eastAsia="Arial" w:hAnsi="Arial"/>
+                <w:b w:val="false"/>
+                <w:bCs w:val="false"/>
+                <w:sz w:val="18"/>
+                <w:szCs w:val="18"/>
+              </w:rPr>
+              <w:t xml:space="preserve">S5</w:t>
+            </w:r>
+          </w:p>
+        </w:tc>
+      </w:tr>
+    </w:tbl>
     <w:p>
       <w:pPr>
         <w:pStyle w:val="Heading1"/>
@@ -2485,7 +4023,7 @@
                 <w:sz w:val="18"/>
                 <w:szCs w:val="18"/>
               </w:rPr>
-              <w:t xml:space="preserve">05–11/10</w:t>
+              <w:t xml:space="preserve">05/10 đến 11/10</w:t>
             </w:r>
           </w:p>
         </w:tc>
@@ -2618,7 +4156,7 @@
                 <w:sz w:val="18"/>
                 <w:szCs w:val="18"/>
               </w:rPr>
-              <w:t xml:space="preserve">12–18/10</w:t>
+              <w:t xml:space="preserve">12/10 đến 18/10</w:t>
             </w:r>
           </w:p>
         </w:tc>
@@ -2751,7 +4289,7 @@
                 <w:sz w:val="18"/>
                 <w:szCs w:val="18"/>
               </w:rPr>
-              <w:t xml:space="preserve">19–25/10</w:t>
+              <w:t xml:space="preserve">19/10 đến 25/10</w:t>
             </w:r>
           </w:p>
         </w:tc>
@@ -2783,7 +4321,7 @@
                 <w:sz w:val="18"/>
                 <w:szCs w:val="18"/>
               </w:rPr>
-              <w:t xml:space="preserve">Khuyến mãi theo sản phẩm tự áp vào order; quản lý kho và nhập hàng</w:t>
+              <w:t xml:space="preserve">Khuyến mãi theo sản phẩm tự áp vào order; quản lý kho, nguyên liệu, nhà cung cấp, nhập hàng</w:t>
             </w:r>
           </w:p>
         </w:tc>
@@ -2884,7 +4422,7 @@
                 <w:sz w:val="18"/>
                 <w:szCs w:val="18"/>
               </w:rPr>
-              <w:t xml:space="preserve">26/10–01/11</w:t>
+              <w:t xml:space="preserve">26/10 đến 01/11</w:t>
             </w:r>
           </w:p>
         </w:tc>
@@ -3017,7 +4555,7 @@
                 <w:sz w:val="18"/>
                 <w:szCs w:val="18"/>
               </w:rPr>
-              <w:t xml:space="preserve">02–05/11</w:t>
+              <w:t xml:space="preserve">02/11 đến 05/11</w:t>
             </w:r>
           </w:p>
         </w:tc>
@@ -3150,7 +4688,7 @@
                 <w:sz w:val="18"/>
                 <w:szCs w:val="18"/>
               </w:rPr>
-              <w:t xml:space="preserve">06–07/11</w:t>
+              <w:t xml:space="preserve">06/11 đến 07/11</w:t>
             </w:r>
           </w:p>
         </w:tc>
@@ -3214,7 +4752,7 @@
                 <w:sz w:val="18"/>
                 <w:szCs w:val="18"/>
               </w:rPr>
-              <w:t xml:space="preserve">–</w:t>
+              <w:t xml:space="preserve">0</w:t>
             </w:r>
           </w:p>
         </w:tc>
@@ -3452,7 +4990,7 @@
                 <w:sz w:val="18"/>
                 <w:szCs w:val="18"/>
               </w:rPr>
-              <w:t xml:space="preserve">AUTH-01 (3), middleware phân quyền (3), SP-01 CRUD sản phẩm/danh mục (5)</w:t>
+              <w:t xml:space="preserve">AUTH-01 (3), middleware phân quyền (3), SP-01…SP-05 danh mục và sản phẩm (5)</w:t>
             </w:r>
           </w:p>
         </w:tc>
@@ -3851,7 +5389,7 @@
                 <w:sz w:val="18"/>
                 <w:szCs w:val="18"/>
               </w:rPr>
-              <w:t xml:space="preserve">Trừ kho trong POS-08 (5), KHO-06 (3), KH-05 (2), AUTH-02 (2)</w:t>
+              <w:t xml:space="preserve">Trừ và trả kho khi gọi, sửa, hủy order (5), KHO-06 (3), KH-05 (2), AUTH-02 (2)</w:t>
             </w:r>
           </w:p>
         </w:tc>
@@ -4438,7 +5976,7 @@
                 <w:sz w:val="18"/>
                 <w:szCs w:val="18"/>
               </w:rPr>
-              <w:t xml:space="preserve">Mỗi sản phẩm áp một khuyến mãi tốt nhất, không cộng dồn</w:t>
+              <w:t xml:space="preserve">Giảm theo phần trăm hoặc số tiền, tính trên giá gốc của từng ly; chưa cần giao diện báo cáo riêng</w:t>
             </w:r>
           </w:p>
         </w:tc>
@@ -4554,7 +6092,7 @@
                 <w:sz w:val="18"/>
                 <w:szCs w:val="18"/>
               </w:rPr>
-              <w:t xml:space="preserve">CRUD (SP-01, KHO-01/02, NS-04)</w:t>
+              <w:t xml:space="preserve">CRUD (SP-01…SP-05, KHO-01, KHO-02, NS-04)</w:t>
             </w:r>
           </w:p>
         </w:tc>
@@ -4992,7 +6530,7 @@
                 <w:sz w:val="18"/>
                 <w:szCs w:val="18"/>
               </w:rPr>
-              <w:t xml:space="preserve">Nếu thấp hơn: như trên; tính lại velocity để chia lại S3–S5</w:t>
+              <w:t xml:space="preserve">Nếu thấp hơn: như trên; tính lại velocity để chia lại S3 đến S5</w:t>
             </w:r>
           </w:p>
         </w:tc>
@@ -5172,7 +6710,7 @@
         <w:rPr>
           <w:rFonts w:ascii="Arial" w:cs="Arial" w:eastAsia="Arial" w:hAnsi="Arial"/>
         </w:rPr>
-        <w:t xml:space="preserve">Continuous integration: merge sớm, mỗi lần merge chạy toàn bộ test.</w:t>
+        <w:t xml:space="preserve">Continuous integration: merge sớm và chạy toàn bộ test trước mỗi lần merge. Chưa có máy chủ CI tự động; báo cáo ghi đây là hướng phát triển.</w:t>
       </w:r>
     </w:p>
     <w:p>
@@ -5558,7 +7096,7 @@
                 <w:sz w:val="18"/>
                 <w:szCs w:val="18"/>
               </w:rPr>
-              <w:t xml:space="preserve">Thiếu tài liệu, khó bảo trì (slide 49–50)</w:t>
+              <w:t xml:space="preserve">Thiếu tài liệu, khó bảo trì (slide 49 đến 50)</w:t>
             </w:r>
           </w:p>
         </w:tc>
@@ -5860,7 +7398,7 @@
         <w:rPr>
           <w:rFonts w:ascii="Arial" w:cs="Arial" w:eastAsia="Arial" w:hAnsi="Arial"/>
         </w:rPr>
-        <w:t xml:space="preserve">S5 chỉ có 4 ngày mà gánh 21 điểm; hai ngày đệm 06–07/11 là phần dự phòng duy nhất.</w:t>
+        <w:t xml:space="preserve">S5 chỉ có 4 ngày mà gánh 21 điểm; hai ngày đệm 06/11 và 07/11 là phần dự phòng duy nhất.</w:t>
       </w:r>
     </w:p>
     <w:p>
@@ -5908,7 +7446,7 @@
         <w:rPr>
           <w:rFonts w:ascii="Arial" w:cs="Arial" w:eastAsia="Arial" w:hAnsi="Arial"/>
         </w:rPr>
-        <w:t xml:space="preserve">Sprint 1 tuần lệch khỏi slide (slide nói 2–4 tuần); chọn vậy để đo velocity sớm.</w:t>
+        <w:t xml:space="preserve">Sprint 1 tuần ngắn hơn khuyến nghị của slide (2 đến 4 tuần); chọn vậy để đo velocity sớm.</w:t>
       </w:r>
     </w:p>
     <w:sectPr>
@@ -5976,7 +7514,7 @@
         <w:sz w:val="16"/>
         <w:szCs w:val="16"/>
       </w:rPr>
-      <w:t xml:space="preserve">Kế hoạch Agile – quản lý quán cà phê – Trang </w:t>
+      <w:t xml:space="preserve">Kế hoạch Agile, quản lý quán cà phê, trang </w:t>
     </w:r>
     <w:r>
       <w:rPr>
@@ -6340,7 +7878,7 @@
       <w:rFonts w:ascii="Arial" w:cs="Arial" w:eastAsia="Arial" w:hAnsi="Arial"/>
       <w:b/>
       <w:bCs/>
-      <w:color w:val="1F3864"/>
+      <w:color w:val="000000"/>
       <w:sz w:val="32"/>
       <w:szCs w:val="32"/>
     </w:rPr>
@@ -6358,7 +7896,7 @@
       <w:rFonts w:ascii="Arial" w:cs="Arial" w:eastAsia="Arial" w:hAnsi="Arial"/>
       <w:b/>
       <w:bCs/>
-      <w:color w:val="2E5597"/>
+      <w:color w:val="000000"/>
       <w:sz w:val="25"/>
       <w:szCs w:val="25"/>
     </w:rPr>

</xml_diff>